<commit_message>
Use Kanit in TRUE agent handover manual
</commit_message>
<xml_diff>
--- a/deliverables/public/DomainWatch-TRUE-Agent-คู่มือส่งมอบ-v1.0.docx
+++ b/deliverables/public/DomainWatch-TRUE-Agent-คู่มือส่งมอบ-v1.0.docx
@@ -4,12 +4,12 @@
   <w:body>
     <w:p>
       <w:pPr>
-        <w:spacing w:before="900"/>
+        <w:spacing w:before="640"/>
         <w:jc w:val="center"/>
       </w:pPr>
       <w:r>
         <w:rPr>
-          <w:rFonts w:ascii="Tahoma" w:hAnsi="Tahoma" w:eastAsia="Tahoma" w:cs="Tahoma"/>
+          <w:rFonts w:ascii="Kanit" w:hAnsi="Kanit" w:eastAsia="Kanit" w:cs="Kanit"/>
           <w:b/>
           <w:color w:val="2458E6"/>
           <w:sz w:val="100"/>
@@ -24,7 +24,7 @@
       </w:pPr>
       <w:r>
         <w:rPr>
-          <w:rFonts w:ascii="Tahoma" w:hAnsi="Tahoma" w:eastAsia="Tahoma" w:cs="Tahoma"/>
+          <w:rFonts w:ascii="Kanit" w:hAnsi="Kanit" w:eastAsia="Kanit" w:cs="Kanit"/>
           <w:b/>
           <w:color w:val="172554"/>
           <w:sz w:val="34"/>
@@ -35,12 +35,12 @@
     </w:p>
     <w:p>
       <w:pPr>
-        <w:spacing w:before="1100"/>
+        <w:spacing w:before="760"/>
         <w:jc w:val="center"/>
       </w:pPr>
       <w:r>
         <w:rPr>
-          <w:rFonts w:ascii="Tahoma" w:hAnsi="Tahoma" w:eastAsia="Tahoma" w:cs="Tahoma"/>
+          <w:rFonts w:ascii="Kanit" w:hAnsi="Kanit" w:eastAsia="Kanit" w:cs="Kanit"/>
           <w:b/>
           <w:color w:val="172554"/>
           <w:sz w:val="58"/>
@@ -57,7 +57,7 @@
       </w:pPr>
       <w:r>
         <w:rPr>
-          <w:rFonts w:ascii="Tahoma" w:hAnsi="Tahoma" w:eastAsia="Tahoma" w:cs="Tahoma"/>
+          <w:rFonts w:ascii="Kanit" w:hAnsi="Kanit" w:eastAsia="Kanit" w:cs="Kanit"/>
           <w:color w:val="64748B"/>
           <w:sz w:val="26"/>
           <w:lang w:val="th-TH" w:bidi="th-TH"/>
@@ -71,12 +71,12 @@
       </w:pPr>
       <w:r>
         <w:rPr>
-          <w:rFonts w:ascii="Tahoma" w:hAnsi="Tahoma" w:eastAsia="Tahoma" w:cs="Tahoma"/>
+          <w:rFonts w:ascii="Kanit" w:hAnsi="Kanit" w:eastAsia="Kanit" w:cs="Kanit"/>
           <w:lang w:val="th-TH" w:bidi="th-TH"/>
         </w:rPr>
         <w:drawing>
           <wp:inline xmlns:a="http://schemas.openxmlformats.org/drawingml/2006/main" xmlns:pic="http://schemas.openxmlformats.org/drawingml/2006/picture">
-            <wp:extent cx="2520000" cy="4480000"/>
+            <wp:extent cx="2088000" cy="3712000"/>
             <wp:docPr id="1" name="Picture 1"/>
             <wp:cNvGraphicFramePr>
               <a:graphicFrameLocks noChangeAspect="1"/>
@@ -97,7 +97,7 @@
                   <pic:spPr>
                     <a:xfrm>
                       <a:off x="0" y="0"/>
-                      <a:ext cx="2520000" cy="4480000"/>
+                      <a:ext cx="2088000" cy="3712000"/>
                     </a:xfrm>
                     <a:prstGeom prst="rect"/>
                   </pic:spPr>
@@ -114,7 +114,7 @@
       </w:pPr>
       <w:r>
         <w:rPr>
-          <w:rFonts w:ascii="Tahoma" w:hAnsi="Tahoma" w:eastAsia="Tahoma" w:cs="Tahoma"/>
+          <w:rFonts w:ascii="Kanit" w:hAnsi="Kanit" w:eastAsia="Kanit" w:cs="Kanit"/>
           <w:color w:val="64748B"/>
           <w:sz w:val="18"/>
           <w:lang w:val="th-TH" w:bidi="th-TH"/>
@@ -125,7 +125,7 @@
     <w:p>
       <w:r>
         <w:rPr>
-          <w:rFonts w:ascii="Tahoma" w:hAnsi="Tahoma" w:eastAsia="Tahoma" w:cs="Tahoma"/>
+          <w:rFonts w:ascii="Kanit" w:hAnsi="Kanit" w:eastAsia="Kanit" w:cs="Kanit"/>
           <w:lang w:val="th-TH" w:bidi="th-TH"/>
         </w:rPr>
         <w:br w:type="page"/>
@@ -137,7 +137,7 @@
       </w:pPr>
       <w:r>
         <w:rPr>
-          <w:rFonts w:ascii="Tahoma" w:hAnsi="Tahoma" w:eastAsia="Tahoma" w:cs="Tahoma"/>
+          <w:rFonts w:ascii="Kanit" w:hAnsi="Kanit" w:eastAsia="Kanit" w:cs="Kanit"/>
           <w:lang w:val="th-TH" w:bidi="th-TH"/>
         </w:rPr>
         <w:t>เริ่มใช้งานแบบเร็ว</w:t>
@@ -149,7 +149,7 @@
       </w:pPr>
       <w:r>
         <w:rPr>
-          <w:rFonts w:ascii="Tahoma" w:hAnsi="Tahoma" w:eastAsia="Tahoma" w:cs="Tahoma"/>
+          <w:rFonts w:ascii="Kanit" w:hAnsi="Kanit" w:eastAsia="Kanit" w:cs="Kanit"/>
           <w:lang w:val="th-TH" w:bidi="th-TH"/>
         </w:rPr>
         <w:t>ใช้เวลาโดยประมาณ 10–15 นาที เมื่อโทรศัพท์มีซิม TRUE และอินเทอร์เน็ตพร้อม</w:t>
@@ -175,7 +175,7 @@
           <w:p>
             <w:r>
               <w:rPr>
-                <w:rFonts w:ascii="Tahoma" w:hAnsi="Tahoma" w:eastAsia="Tahoma" w:cs="Tahoma"/>
+                <w:rFonts w:ascii="Kanit" w:hAnsi="Kanit" w:eastAsia="Kanit" w:cs="Kanit"/>
                 <w:b/>
                 <w:color w:val="172554"/>
                 <w:sz w:val="24"/>
@@ -186,7 +186,7 @@
             </w:r>
             <w:r>
               <w:rPr>
-                <w:rFonts w:ascii="Tahoma" w:hAnsi="Tahoma" w:eastAsia="Tahoma" w:cs="Tahoma"/>
+                <w:rFonts w:ascii="Kanit" w:hAnsi="Kanit" w:eastAsia="Kanit" w:cs="Kanit"/>
                 <w:sz w:val="20"/>
                 <w:lang w:val="th-TH" w:bidi="th-TH"/>
               </w:rPr>
@@ -221,7 +221,7 @@
             </w:pPr>
             <w:r>
               <w:rPr>
-                <w:rFonts w:ascii="Tahoma" w:hAnsi="Tahoma" w:eastAsia="Tahoma" w:cs="Tahoma"/>
+                <w:rFonts w:ascii="Kanit" w:hAnsi="Kanit" w:eastAsia="Kanit" w:cs="Kanit"/>
                 <w:b/>
                 <w:color w:val="FFFFFF"/>
                 <w:sz w:val="30"/>
@@ -238,7 +238,7 @@
           <w:p>
             <w:r>
               <w:rPr>
-                <w:rFonts w:ascii="Tahoma" w:hAnsi="Tahoma" w:eastAsia="Tahoma" w:cs="Tahoma"/>
+                <w:rFonts w:ascii="Kanit" w:hAnsi="Kanit" w:eastAsia="Kanit" w:cs="Kanit"/>
                 <w:b/>
                 <w:color w:val="1E293B"/>
                 <w:sz w:val="22"/>
@@ -249,7 +249,7 @@
             </w:r>
             <w:r>
               <w:rPr>
-                <w:rFonts w:ascii="Tahoma" w:hAnsi="Tahoma" w:eastAsia="Tahoma" w:cs="Tahoma"/>
+                <w:rFonts w:ascii="Kanit" w:hAnsi="Kanit" w:eastAsia="Kanit" w:cs="Kanit"/>
                 <w:color w:val="64748B"/>
                 <w:sz w:val="19"/>
                 <w:lang w:val="th-TH" w:bidi="th-TH"/>
@@ -272,7 +272,7 @@
             </w:pPr>
             <w:r>
               <w:rPr>
-                <w:rFonts w:ascii="Tahoma" w:hAnsi="Tahoma" w:eastAsia="Tahoma" w:cs="Tahoma"/>
+                <w:rFonts w:ascii="Kanit" w:hAnsi="Kanit" w:eastAsia="Kanit" w:cs="Kanit"/>
                 <w:b/>
                 <w:color w:val="FFFFFF"/>
                 <w:sz w:val="30"/>
@@ -289,7 +289,7 @@
           <w:p>
             <w:r>
               <w:rPr>
-                <w:rFonts w:ascii="Tahoma" w:hAnsi="Tahoma" w:eastAsia="Tahoma" w:cs="Tahoma"/>
+                <w:rFonts w:ascii="Kanit" w:hAnsi="Kanit" w:eastAsia="Kanit" w:cs="Kanit"/>
                 <w:b/>
                 <w:color w:val="1E293B"/>
                 <w:sz w:val="22"/>
@@ -300,7 +300,7 @@
             </w:r>
             <w:r>
               <w:rPr>
-                <w:rFonts w:ascii="Tahoma" w:hAnsi="Tahoma" w:eastAsia="Tahoma" w:cs="Tahoma"/>
+                <w:rFonts w:ascii="Kanit" w:hAnsi="Kanit" w:eastAsia="Kanit" w:cs="Kanit"/>
                 <w:color w:val="64748B"/>
                 <w:sz w:val="19"/>
                 <w:lang w:val="th-TH" w:bidi="th-TH"/>
@@ -323,7 +323,7 @@
             </w:pPr>
             <w:r>
               <w:rPr>
-                <w:rFonts w:ascii="Tahoma" w:hAnsi="Tahoma" w:eastAsia="Tahoma" w:cs="Tahoma"/>
+                <w:rFonts w:ascii="Kanit" w:hAnsi="Kanit" w:eastAsia="Kanit" w:cs="Kanit"/>
                 <w:b/>
                 <w:color w:val="FFFFFF"/>
                 <w:sz w:val="30"/>
@@ -340,7 +340,7 @@
           <w:p>
             <w:r>
               <w:rPr>
-                <w:rFonts w:ascii="Tahoma" w:hAnsi="Tahoma" w:eastAsia="Tahoma" w:cs="Tahoma"/>
+                <w:rFonts w:ascii="Kanit" w:hAnsi="Kanit" w:eastAsia="Kanit" w:cs="Kanit"/>
                 <w:b/>
                 <w:color w:val="1E293B"/>
                 <w:sz w:val="22"/>
@@ -351,7 +351,7 @@
             </w:r>
             <w:r>
               <w:rPr>
-                <w:rFonts w:ascii="Tahoma" w:hAnsi="Tahoma" w:eastAsia="Tahoma" w:cs="Tahoma"/>
+                <w:rFonts w:ascii="Kanit" w:hAnsi="Kanit" w:eastAsia="Kanit" w:cs="Kanit"/>
                 <w:color w:val="64748B"/>
                 <w:sz w:val="19"/>
                 <w:lang w:val="th-TH" w:bidi="th-TH"/>
@@ -374,7 +374,7 @@
             </w:pPr>
             <w:r>
               <w:rPr>
-                <w:rFonts w:ascii="Tahoma" w:hAnsi="Tahoma" w:eastAsia="Tahoma" w:cs="Tahoma"/>
+                <w:rFonts w:ascii="Kanit" w:hAnsi="Kanit" w:eastAsia="Kanit" w:cs="Kanit"/>
                 <w:b/>
                 <w:color w:val="FFFFFF"/>
                 <w:sz w:val="30"/>
@@ -391,7 +391,7 @@
           <w:p>
             <w:r>
               <w:rPr>
-                <w:rFonts w:ascii="Tahoma" w:hAnsi="Tahoma" w:eastAsia="Tahoma" w:cs="Tahoma"/>
+                <w:rFonts w:ascii="Kanit" w:hAnsi="Kanit" w:eastAsia="Kanit" w:cs="Kanit"/>
                 <w:b/>
                 <w:color w:val="1E293B"/>
                 <w:sz w:val="22"/>
@@ -402,7 +402,7 @@
             </w:r>
             <w:r>
               <w:rPr>
-                <w:rFonts w:ascii="Tahoma" w:hAnsi="Tahoma" w:eastAsia="Tahoma" w:cs="Tahoma"/>
+                <w:rFonts w:ascii="Kanit" w:hAnsi="Kanit" w:eastAsia="Kanit" w:cs="Kanit"/>
                 <w:color w:val="64748B"/>
                 <w:sz w:val="19"/>
                 <w:lang w:val="th-TH" w:bidi="th-TH"/>
@@ -425,7 +425,7 @@
             </w:pPr>
             <w:r>
               <w:rPr>
-                <w:rFonts w:ascii="Tahoma" w:hAnsi="Tahoma" w:eastAsia="Tahoma" w:cs="Tahoma"/>
+                <w:rFonts w:ascii="Kanit" w:hAnsi="Kanit" w:eastAsia="Kanit" w:cs="Kanit"/>
                 <w:b/>
                 <w:color w:val="FFFFFF"/>
                 <w:sz w:val="30"/>
@@ -442,7 +442,7 @@
           <w:p>
             <w:r>
               <w:rPr>
-                <w:rFonts w:ascii="Tahoma" w:hAnsi="Tahoma" w:eastAsia="Tahoma" w:cs="Tahoma"/>
+                <w:rFonts w:ascii="Kanit" w:hAnsi="Kanit" w:eastAsia="Kanit" w:cs="Kanit"/>
                 <w:b/>
                 <w:color w:val="1E293B"/>
                 <w:sz w:val="22"/>
@@ -453,7 +453,7 @@
             </w:r>
             <w:r>
               <w:rPr>
-                <w:rFonts w:ascii="Tahoma" w:hAnsi="Tahoma" w:eastAsia="Tahoma" w:cs="Tahoma"/>
+                <w:rFonts w:ascii="Kanit" w:hAnsi="Kanit" w:eastAsia="Kanit" w:cs="Kanit"/>
                 <w:color w:val="64748B"/>
                 <w:sz w:val="19"/>
                 <w:lang w:val="th-TH" w:bidi="th-TH"/>
@@ -471,7 +471,7 @@
       </w:pPr>
       <w:r>
         <w:rPr>
-          <w:rFonts w:ascii="Tahoma" w:hAnsi="Tahoma" w:eastAsia="Tahoma" w:cs="Tahoma"/>
+          <w:rFonts w:ascii="Kanit" w:hAnsi="Kanit" w:eastAsia="Kanit" w:cs="Kanit"/>
           <w:lang w:val="th-TH" w:bidi="th-TH"/>
         </w:rPr>
         <w:t>ของที่ต้องเตรียม</w:t>
@@ -484,7 +484,7 @@
       </w:pPr>
       <w:r>
         <w:rPr>
-          <w:rFonts w:ascii="Tahoma" w:hAnsi="Tahoma" w:eastAsia="Tahoma" w:cs="Tahoma"/>
+          <w:rFonts w:ascii="Kanit" w:hAnsi="Kanit" w:eastAsia="Kanit" w:cs="Kanit"/>
           <w:lang w:val="th-TH" w:bidi="th-TH"/>
         </w:rPr>
         <w:t>☐ โทรศัพท์ Android 8 ขึ้นไป พร้อมที่ชาร์จถาวร</w:t>
@@ -497,7 +497,7 @@
       </w:pPr>
       <w:r>
         <w:rPr>
-          <w:rFonts w:ascii="Tahoma" w:hAnsi="Tahoma" w:eastAsia="Tahoma" w:cs="Tahoma"/>
+          <w:rFonts w:ascii="Kanit" w:hAnsi="Kanit" w:eastAsia="Kanit" w:cs="Kanit"/>
           <w:lang w:val="th-TH" w:bidi="th-TH"/>
         </w:rPr>
         <w:t>☐ ซิม TRUE เปิดใช้งาน Mobile data และมีแพ็กเกจอินเทอร์เน็ต</w:t>
@@ -510,7 +510,7 @@
       </w:pPr>
       <w:r>
         <w:rPr>
-          <w:rFonts w:ascii="Tahoma" w:hAnsi="Tahoma" w:eastAsia="Tahoma" w:cs="Tahoma"/>
+          <w:rFonts w:ascii="Kanit" w:hAnsi="Kanit" w:eastAsia="Kanit" w:cs="Kanit"/>
           <w:lang w:val="th-TH" w:bidi="th-TH"/>
         </w:rPr>
         <w:t>☐ บัญชี DomainWatch บทบาท ADMIN</w:t>
@@ -523,7 +523,7 @@
       </w:pPr>
       <w:r>
         <w:rPr>
-          <w:rFonts w:ascii="Tahoma" w:hAnsi="Tahoma" w:eastAsia="Tahoma" w:cs="Tahoma"/>
+          <w:rFonts w:ascii="Kanit" w:hAnsi="Kanit" w:eastAsia="Kanit" w:cs="Kanit"/>
           <w:lang w:val="th-TH" w:bidi="th-TH"/>
         </w:rPr>
         <w:t>☐ Wi‑Fi เปิดไว้ได้ แต่แอปจะบังคับการตรวจผ่าน Cellular</w:t>
@@ -536,7 +536,7 @@
       </w:pPr>
       <w:r>
         <w:rPr>
-          <w:rFonts w:ascii="Tahoma" w:hAnsi="Tahoma" w:eastAsia="Tahoma" w:cs="Tahoma"/>
+          <w:rFonts w:ascii="Kanit" w:hAnsi="Kanit" w:eastAsia="Kanit" w:cs="Kanit"/>
           <w:lang w:val="th-TH" w:bidi="th-TH"/>
         </w:rPr>
         <w:t>☐ ตำแหน่งวางเครื่องมีสัญญาณ TRUE เสถียรและระบายความร้อนได้</w:t>
@@ -545,7 +545,7 @@
     <w:p>
       <w:r>
         <w:rPr>
-          <w:rFonts w:ascii="Tahoma" w:hAnsi="Tahoma" w:eastAsia="Tahoma" w:cs="Tahoma"/>
+          <w:rFonts w:ascii="Kanit" w:hAnsi="Kanit" w:eastAsia="Kanit" w:cs="Kanit"/>
           <w:lang w:val="th-TH" w:bidi="th-TH"/>
         </w:rPr>
         <w:br w:type="page"/>
@@ -557,7 +557,7 @@
       </w:pPr>
       <w:r>
         <w:rPr>
-          <w:rFonts w:ascii="Tahoma" w:hAnsi="Tahoma" w:eastAsia="Tahoma" w:cs="Tahoma"/>
+          <w:rFonts w:ascii="Kanit" w:hAnsi="Kanit" w:eastAsia="Kanit" w:cs="Kanit"/>
           <w:lang w:val="th-TH" w:bidi="th-TH"/>
         </w:rPr>
         <w:t>ระบบทำงานอย่างไร</w:t>
@@ -569,7 +569,7 @@
       </w:pPr>
       <w:r>
         <w:rPr>
-          <w:rFonts w:ascii="Tahoma" w:hAnsi="Tahoma" w:eastAsia="Tahoma" w:cs="Tahoma"/>
+          <w:rFonts w:ascii="Kanit" w:hAnsi="Kanit" w:eastAsia="Kanit" w:cs="Kanit"/>
           <w:lang w:val="th-TH" w:bidi="th-TH"/>
         </w:rPr>
         <w:t>ตัวตรวจจากซิมจริงทำงานแยกจากตัวตรวจบน Vercel เพื่อยืนยันปัญหาที่ผู้ใช้เครือข่ายมือถือพบจริง</w:t>
@@ -581,7 +581,7 @@
       </w:pPr>
       <w:r>
         <w:rPr>
-          <w:rFonts w:ascii="Tahoma" w:hAnsi="Tahoma" w:eastAsia="Tahoma" w:cs="Tahoma"/>
+          <w:rFonts w:ascii="Kanit" w:hAnsi="Kanit" w:eastAsia="Kanit" w:cs="Kanit"/>
           <w:lang w:val="th-TH" w:bidi="th-TH"/>
         </w:rPr>
         <w:drawing>
@@ -625,7 +625,7 @@
       </w:pPr>
       <w:r>
         <w:rPr>
-          <w:rFonts w:ascii="Tahoma" w:hAnsi="Tahoma" w:eastAsia="Tahoma" w:cs="Tahoma"/>
+          <w:rFonts w:ascii="Kanit" w:hAnsi="Kanit" w:eastAsia="Kanit" w:cs="Kanit"/>
           <w:lang w:val="th-TH" w:bidi="th-TH"/>
         </w:rPr>
         <w:t>ภาพที่ 1 — Flow การตรวจจากโทรศัพท์ซิม TRUE ไปยัง DomainWatch และ Telegram</w:t>
@@ -637,7 +637,7 @@
       </w:pPr>
       <w:r>
         <w:rPr>
-          <w:rFonts w:ascii="Tahoma" w:hAnsi="Tahoma" w:eastAsia="Tahoma" w:cs="Tahoma"/>
+          <w:rFonts w:ascii="Kanit" w:hAnsi="Kanit" w:eastAsia="Kanit" w:cs="Kanit"/>
           <w:lang w:val="th-TH" w:bidi="th-TH"/>
         </w:rPr>
         <w:t>กติกาความแม่นยำ</w:t>
@@ -667,7 +667,7 @@
             </w:pPr>
             <w:r>
               <w:rPr>
-                <w:rFonts w:ascii="Tahoma" w:hAnsi="Tahoma" w:eastAsia="Tahoma" w:cs="Tahoma"/>
+                <w:rFonts w:ascii="Kanit" w:hAnsi="Kanit" w:eastAsia="Kanit" w:cs="Kanit"/>
                 <w:b/>
                 <w:color w:val="FFFFFF"/>
                 <w:sz w:val="30"/>
@@ -684,7 +684,7 @@
           <w:p>
             <w:r>
               <w:rPr>
-                <w:rFonts w:ascii="Tahoma" w:hAnsi="Tahoma" w:eastAsia="Tahoma" w:cs="Tahoma"/>
+                <w:rFonts w:ascii="Kanit" w:hAnsi="Kanit" w:eastAsia="Kanit" w:cs="Kanit"/>
                 <w:b/>
                 <w:color w:val="1E293B"/>
                 <w:sz w:val="22"/>
@@ -695,7 +695,7 @@
             </w:r>
             <w:r>
               <w:rPr>
-                <w:rFonts w:ascii="Tahoma" w:hAnsi="Tahoma" w:eastAsia="Tahoma" w:cs="Tahoma"/>
+                <w:rFonts w:ascii="Kanit" w:hAnsi="Kanit" w:eastAsia="Kanit" w:cs="Kanit"/>
                 <w:color w:val="64748B"/>
                 <w:sz w:val="19"/>
                 <w:lang w:val="th-TH" w:bidi="th-TH"/>
@@ -718,7 +718,7 @@
             </w:pPr>
             <w:r>
               <w:rPr>
-                <w:rFonts w:ascii="Tahoma" w:hAnsi="Tahoma" w:eastAsia="Tahoma" w:cs="Tahoma"/>
+                <w:rFonts w:ascii="Kanit" w:hAnsi="Kanit" w:eastAsia="Kanit" w:cs="Kanit"/>
                 <w:b/>
                 <w:color w:val="FFFFFF"/>
                 <w:sz w:val="30"/>
@@ -735,7 +735,7 @@
           <w:p>
             <w:r>
               <w:rPr>
-                <w:rFonts w:ascii="Tahoma" w:hAnsi="Tahoma" w:eastAsia="Tahoma" w:cs="Tahoma"/>
+                <w:rFonts w:ascii="Kanit" w:hAnsi="Kanit" w:eastAsia="Kanit" w:cs="Kanit"/>
                 <w:b/>
                 <w:color w:val="1E293B"/>
                 <w:sz w:val="22"/>
@@ -746,7 +746,7 @@
             </w:r>
             <w:r>
               <w:rPr>
-                <w:rFonts w:ascii="Tahoma" w:hAnsi="Tahoma" w:eastAsia="Tahoma" w:cs="Tahoma"/>
+                <w:rFonts w:ascii="Kanit" w:hAnsi="Kanit" w:eastAsia="Kanit" w:cs="Kanit"/>
                 <w:color w:val="64748B"/>
                 <w:sz w:val="19"/>
                 <w:lang w:val="th-TH" w:bidi="th-TH"/>
@@ -769,7 +769,7 @@
             </w:pPr>
             <w:r>
               <w:rPr>
-                <w:rFonts w:ascii="Tahoma" w:hAnsi="Tahoma" w:eastAsia="Tahoma" w:cs="Tahoma"/>
+                <w:rFonts w:ascii="Kanit" w:hAnsi="Kanit" w:eastAsia="Kanit" w:cs="Kanit"/>
                 <w:b/>
                 <w:color w:val="FFFFFF"/>
                 <w:sz w:val="30"/>
@@ -786,7 +786,7 @@
           <w:p>
             <w:r>
               <w:rPr>
-                <w:rFonts w:ascii="Tahoma" w:hAnsi="Tahoma" w:eastAsia="Tahoma" w:cs="Tahoma"/>
+                <w:rFonts w:ascii="Kanit" w:hAnsi="Kanit" w:eastAsia="Kanit" w:cs="Kanit"/>
                 <w:b/>
                 <w:color w:val="1E293B"/>
                 <w:sz w:val="22"/>
@@ -797,7 +797,7 @@
             </w:r>
             <w:r>
               <w:rPr>
-                <w:rFonts w:ascii="Tahoma" w:hAnsi="Tahoma" w:eastAsia="Tahoma" w:cs="Tahoma"/>
+                <w:rFonts w:ascii="Kanit" w:hAnsi="Kanit" w:eastAsia="Kanit" w:cs="Kanit"/>
                 <w:color w:val="64748B"/>
                 <w:sz w:val="19"/>
                 <w:lang w:val="th-TH" w:bidi="th-TH"/>
@@ -820,7 +820,7 @@
             </w:pPr>
             <w:r>
               <w:rPr>
-                <w:rFonts w:ascii="Tahoma" w:hAnsi="Tahoma" w:eastAsia="Tahoma" w:cs="Tahoma"/>
+                <w:rFonts w:ascii="Kanit" w:hAnsi="Kanit" w:eastAsia="Kanit" w:cs="Kanit"/>
                 <w:b/>
                 <w:color w:val="FFFFFF"/>
                 <w:sz w:val="30"/>
@@ -837,7 +837,7 @@
           <w:p>
             <w:r>
               <w:rPr>
-                <w:rFonts w:ascii="Tahoma" w:hAnsi="Tahoma" w:eastAsia="Tahoma" w:cs="Tahoma"/>
+                <w:rFonts w:ascii="Kanit" w:hAnsi="Kanit" w:eastAsia="Kanit" w:cs="Kanit"/>
                 <w:b/>
                 <w:color w:val="1E293B"/>
                 <w:sz w:val="22"/>
@@ -848,7 +848,7 @@
             </w:r>
             <w:r>
               <w:rPr>
-                <w:rFonts w:ascii="Tahoma" w:hAnsi="Tahoma" w:eastAsia="Tahoma" w:cs="Tahoma"/>
+                <w:rFonts w:ascii="Kanit" w:hAnsi="Kanit" w:eastAsia="Kanit" w:cs="Kanit"/>
                 <w:color w:val="64748B"/>
                 <w:sz w:val="19"/>
                 <w:lang w:val="th-TH" w:bidi="th-TH"/>
@@ -861,21 +861,12 @@
     </w:tbl>
     <w:p/>
     <w:p>
-      <w:r>
-        <w:rPr>
-          <w:rFonts w:ascii="Tahoma" w:hAnsi="Tahoma" w:eastAsia="Tahoma" w:cs="Tahoma"/>
-          <w:lang w:val="th-TH" w:bidi="th-TH"/>
-        </w:rPr>
-        <w:br w:type="page"/>
-      </w:r>
-    </w:p>
-    <w:p>
       <w:pPr>
         <w:pStyle w:val="Title"/>
       </w:pPr>
       <w:r>
         <w:rPr>
-          <w:rFonts w:ascii="Tahoma" w:hAnsi="Tahoma" w:eastAsia="Tahoma" w:cs="Tahoma"/>
+          <w:rFonts w:ascii="Kanit" w:hAnsi="Kanit" w:eastAsia="Kanit" w:cs="Kanit"/>
           <w:lang w:val="th-TH" w:bidi="th-TH"/>
         </w:rPr>
         <w:t>ตั้งค่าเครื่องจากหน้าแอดมิน</w:t>
@@ -887,7 +878,7 @@
       </w:pPr>
       <w:r>
         <w:rPr>
-          <w:rFonts w:ascii="Tahoma" w:hAnsi="Tahoma" w:eastAsia="Tahoma" w:cs="Tahoma"/>
+          <w:rFonts w:ascii="Kanit" w:hAnsi="Kanit" w:eastAsia="Kanit" w:cs="Kanit"/>
           <w:lang w:val="th-TH" w:bidi="th-TH"/>
         </w:rPr>
         <w:t>เมนูนี้เห็นได้เฉพาะ ADMIN และทุก API มีการตรวจสิทธิ์ฝั่ง server</w:t>
@@ -899,7 +890,7 @@
       </w:pPr>
       <w:r>
         <w:rPr>
-          <w:rFonts w:ascii="Tahoma" w:hAnsi="Tahoma" w:eastAsia="Tahoma" w:cs="Tahoma"/>
+          <w:rFonts w:ascii="Kanit" w:hAnsi="Kanit" w:eastAsia="Kanit" w:cs="Kanit"/>
           <w:lang w:val="th-TH" w:bidi="th-TH"/>
         </w:rPr>
         <w:drawing>
@@ -943,7 +934,7 @@
       </w:pPr>
       <w:r>
         <w:rPr>
-          <w:rFonts w:ascii="Tahoma" w:hAnsi="Tahoma" w:eastAsia="Tahoma" w:cs="Tahoma"/>
+          <w:rFonts w:ascii="Kanit" w:hAnsi="Kanit" w:eastAsia="Kanit" w:cs="Kanit"/>
           <w:lang w:val="th-TH" w:bidi="th-TH"/>
         </w:rPr>
         <w:t>ภาพที่ 2 — ตัวอย่างหน้า /agents และ QR ตัวอย่าง (ไม่ใช่ QR ใช้งานจริง)</w:t>
@@ -973,7 +964,7 @@
             </w:pPr>
             <w:r>
               <w:rPr>
-                <w:rFonts w:ascii="Tahoma" w:hAnsi="Tahoma" w:eastAsia="Tahoma" w:cs="Tahoma"/>
+                <w:rFonts w:ascii="Kanit" w:hAnsi="Kanit" w:eastAsia="Kanit" w:cs="Kanit"/>
                 <w:b/>
                 <w:color w:val="FFFFFF"/>
                 <w:sz w:val="30"/>
@@ -990,7 +981,7 @@
           <w:p>
             <w:r>
               <w:rPr>
-                <w:rFonts w:ascii="Tahoma" w:hAnsi="Tahoma" w:eastAsia="Tahoma" w:cs="Tahoma"/>
+                <w:rFonts w:ascii="Kanit" w:hAnsi="Kanit" w:eastAsia="Kanit" w:cs="Kanit"/>
                 <w:b/>
                 <w:color w:val="1E293B"/>
                 <w:sz w:val="22"/>
@@ -1001,7 +992,7 @@
             </w:r>
             <w:r>
               <w:rPr>
-                <w:rFonts w:ascii="Tahoma" w:hAnsi="Tahoma" w:eastAsia="Tahoma" w:cs="Tahoma"/>
+                <w:rFonts w:ascii="Kanit" w:hAnsi="Kanit" w:eastAsia="Kanit" w:cs="Kanit"/>
                 <w:color w:val="64748B"/>
                 <w:sz w:val="19"/>
                 <w:lang w:val="th-TH" w:bidi="th-TH"/>
@@ -1024,7 +1015,7 @@
             </w:pPr>
             <w:r>
               <w:rPr>
-                <w:rFonts w:ascii="Tahoma" w:hAnsi="Tahoma" w:eastAsia="Tahoma" w:cs="Tahoma"/>
+                <w:rFonts w:ascii="Kanit" w:hAnsi="Kanit" w:eastAsia="Kanit" w:cs="Kanit"/>
                 <w:b/>
                 <w:color w:val="FFFFFF"/>
                 <w:sz w:val="30"/>
@@ -1041,7 +1032,7 @@
           <w:p>
             <w:r>
               <w:rPr>
-                <w:rFonts w:ascii="Tahoma" w:hAnsi="Tahoma" w:eastAsia="Tahoma" w:cs="Tahoma"/>
+                <w:rFonts w:ascii="Kanit" w:hAnsi="Kanit" w:eastAsia="Kanit" w:cs="Kanit"/>
                 <w:b/>
                 <w:color w:val="1E293B"/>
                 <w:sz w:val="22"/>
@@ -1052,7 +1043,7 @@
             </w:r>
             <w:r>
               <w:rPr>
-                <w:rFonts w:ascii="Tahoma" w:hAnsi="Tahoma" w:eastAsia="Tahoma" w:cs="Tahoma"/>
+                <w:rFonts w:ascii="Kanit" w:hAnsi="Kanit" w:eastAsia="Kanit" w:cs="Kanit"/>
                 <w:color w:val="64748B"/>
                 <w:sz w:val="19"/>
                 <w:lang w:val="th-TH" w:bidi="th-TH"/>
@@ -1075,7 +1066,7 @@
             </w:pPr>
             <w:r>
               <w:rPr>
-                <w:rFonts w:ascii="Tahoma" w:hAnsi="Tahoma" w:eastAsia="Tahoma" w:cs="Tahoma"/>
+                <w:rFonts w:ascii="Kanit" w:hAnsi="Kanit" w:eastAsia="Kanit" w:cs="Kanit"/>
                 <w:b/>
                 <w:color w:val="FFFFFF"/>
                 <w:sz w:val="30"/>
@@ -1092,7 +1083,7 @@
           <w:p>
             <w:r>
               <w:rPr>
-                <w:rFonts w:ascii="Tahoma" w:hAnsi="Tahoma" w:eastAsia="Tahoma" w:cs="Tahoma"/>
+                <w:rFonts w:ascii="Kanit" w:hAnsi="Kanit" w:eastAsia="Kanit" w:cs="Kanit"/>
                 <w:b/>
                 <w:color w:val="1E293B"/>
                 <w:sz w:val="22"/>
@@ -1103,7 +1094,7 @@
             </w:r>
             <w:r>
               <w:rPr>
-                <w:rFonts w:ascii="Tahoma" w:hAnsi="Tahoma" w:eastAsia="Tahoma" w:cs="Tahoma"/>
+                <w:rFonts w:ascii="Kanit" w:hAnsi="Kanit" w:eastAsia="Kanit" w:cs="Kanit"/>
                 <w:color w:val="64748B"/>
                 <w:sz w:val="19"/>
                 <w:lang w:val="th-TH" w:bidi="th-TH"/>
@@ -1126,7 +1117,7 @@
             </w:pPr>
             <w:r>
               <w:rPr>
-                <w:rFonts w:ascii="Tahoma" w:hAnsi="Tahoma" w:eastAsia="Tahoma" w:cs="Tahoma"/>
+                <w:rFonts w:ascii="Kanit" w:hAnsi="Kanit" w:eastAsia="Kanit" w:cs="Kanit"/>
                 <w:b/>
                 <w:color w:val="FFFFFF"/>
                 <w:sz w:val="30"/>
@@ -1143,7 +1134,7 @@
           <w:p>
             <w:r>
               <w:rPr>
-                <w:rFonts w:ascii="Tahoma" w:hAnsi="Tahoma" w:eastAsia="Tahoma" w:cs="Tahoma"/>
+                <w:rFonts w:ascii="Kanit" w:hAnsi="Kanit" w:eastAsia="Kanit" w:cs="Kanit"/>
                 <w:b/>
                 <w:color w:val="1E293B"/>
                 <w:sz w:val="22"/>
@@ -1154,7 +1145,7 @@
             </w:r>
             <w:r>
               <w:rPr>
-                <w:rFonts w:ascii="Tahoma" w:hAnsi="Tahoma" w:eastAsia="Tahoma" w:cs="Tahoma"/>
+                <w:rFonts w:ascii="Kanit" w:hAnsi="Kanit" w:eastAsia="Kanit" w:cs="Kanit"/>
                 <w:color w:val="64748B"/>
                 <w:sz w:val="19"/>
                 <w:lang w:val="th-TH" w:bidi="th-TH"/>
@@ -1169,7 +1160,7 @@
     <w:p>
       <w:r>
         <w:rPr>
-          <w:rFonts w:ascii="Tahoma" w:hAnsi="Tahoma" w:eastAsia="Tahoma" w:cs="Tahoma"/>
+          <w:rFonts w:ascii="Kanit" w:hAnsi="Kanit" w:eastAsia="Kanit" w:cs="Kanit"/>
           <w:lang w:val="th-TH" w:bidi="th-TH"/>
         </w:rPr>
         <w:br w:type="page"/>
@@ -1181,7 +1172,7 @@
       </w:pPr>
       <w:r>
         <w:rPr>
-          <w:rFonts w:ascii="Tahoma" w:hAnsi="Tahoma" w:eastAsia="Tahoma" w:cs="Tahoma"/>
+          <w:rFonts w:ascii="Kanit" w:hAnsi="Kanit" w:eastAsia="Kanit" w:cs="Kanit"/>
           <w:lang w:val="th-TH" w:bidi="th-TH"/>
         </w:rPr>
         <w:t>ติดตั้ง APK บนโทรศัพท์ Android</w:t>
@@ -1193,7 +1184,7 @@
       </w:pPr>
       <w:r>
         <w:rPr>
-          <w:rFonts w:ascii="Tahoma" w:hAnsi="Tahoma" w:eastAsia="Tahoma" w:cs="Tahoma"/>
+          <w:rFonts w:ascii="Kanit" w:hAnsi="Kanit" w:eastAsia="Kanit" w:cs="Kanit"/>
           <w:lang w:val="th-TH" w:bidi="th-TH"/>
         </w:rPr>
         <w:t>ไม่ต้องใช้ Termux, Termux:Boot หรือ Termux:API</w:t>
@@ -1223,7 +1214,7 @@
             </w:pPr>
             <w:r>
               <w:rPr>
-                <w:rFonts w:ascii="Tahoma" w:hAnsi="Tahoma" w:eastAsia="Tahoma" w:cs="Tahoma"/>
+                <w:rFonts w:ascii="Kanit" w:hAnsi="Kanit" w:eastAsia="Kanit" w:cs="Kanit"/>
                 <w:b/>
                 <w:color w:val="FFFFFF"/>
                 <w:sz w:val="30"/>
@@ -1240,7 +1231,7 @@
           <w:p>
             <w:r>
               <w:rPr>
-                <w:rFonts w:ascii="Tahoma" w:hAnsi="Tahoma" w:eastAsia="Tahoma" w:cs="Tahoma"/>
+                <w:rFonts w:ascii="Kanit" w:hAnsi="Kanit" w:eastAsia="Kanit" w:cs="Kanit"/>
                 <w:b/>
                 <w:color w:val="1E293B"/>
                 <w:sz w:val="22"/>
@@ -1251,7 +1242,7 @@
             </w:r>
             <w:r>
               <w:rPr>
-                <w:rFonts w:ascii="Tahoma" w:hAnsi="Tahoma" w:eastAsia="Tahoma" w:cs="Tahoma"/>
+                <w:rFonts w:ascii="Kanit" w:hAnsi="Kanit" w:eastAsia="Kanit" w:cs="Kanit"/>
                 <w:color w:val="64748B"/>
                 <w:sz w:val="19"/>
                 <w:lang w:val="th-TH" w:bidi="th-TH"/>
@@ -1274,7 +1265,7 @@
             </w:pPr>
             <w:r>
               <w:rPr>
-                <w:rFonts w:ascii="Tahoma" w:hAnsi="Tahoma" w:eastAsia="Tahoma" w:cs="Tahoma"/>
+                <w:rFonts w:ascii="Kanit" w:hAnsi="Kanit" w:eastAsia="Kanit" w:cs="Kanit"/>
                 <w:b/>
                 <w:color w:val="FFFFFF"/>
                 <w:sz w:val="30"/>
@@ -1291,7 +1282,7 @@
           <w:p>
             <w:r>
               <w:rPr>
-                <w:rFonts w:ascii="Tahoma" w:hAnsi="Tahoma" w:eastAsia="Tahoma" w:cs="Tahoma"/>
+                <w:rFonts w:ascii="Kanit" w:hAnsi="Kanit" w:eastAsia="Kanit" w:cs="Kanit"/>
                 <w:b/>
                 <w:color w:val="1E293B"/>
                 <w:sz w:val="22"/>
@@ -1302,7 +1293,7 @@
             </w:r>
             <w:r>
               <w:rPr>
-                <w:rFonts w:ascii="Tahoma" w:hAnsi="Tahoma" w:eastAsia="Tahoma" w:cs="Tahoma"/>
+                <w:rFonts w:ascii="Kanit" w:hAnsi="Kanit" w:eastAsia="Kanit" w:cs="Kanit"/>
                 <w:color w:val="64748B"/>
                 <w:sz w:val="19"/>
                 <w:lang w:val="th-TH" w:bidi="th-TH"/>
@@ -1325,7 +1316,7 @@
             </w:pPr>
             <w:r>
               <w:rPr>
-                <w:rFonts w:ascii="Tahoma" w:hAnsi="Tahoma" w:eastAsia="Tahoma" w:cs="Tahoma"/>
+                <w:rFonts w:ascii="Kanit" w:hAnsi="Kanit" w:eastAsia="Kanit" w:cs="Kanit"/>
                 <w:b/>
                 <w:color w:val="FFFFFF"/>
                 <w:sz w:val="30"/>
@@ -1342,7 +1333,7 @@
           <w:p>
             <w:r>
               <w:rPr>
-                <w:rFonts w:ascii="Tahoma" w:hAnsi="Tahoma" w:eastAsia="Tahoma" w:cs="Tahoma"/>
+                <w:rFonts w:ascii="Kanit" w:hAnsi="Kanit" w:eastAsia="Kanit" w:cs="Kanit"/>
                 <w:b/>
                 <w:color w:val="1E293B"/>
                 <w:sz w:val="22"/>
@@ -1353,7 +1344,7 @@
             </w:r>
             <w:r>
               <w:rPr>
-                <w:rFonts w:ascii="Tahoma" w:hAnsi="Tahoma" w:eastAsia="Tahoma" w:cs="Tahoma"/>
+                <w:rFonts w:ascii="Kanit" w:hAnsi="Kanit" w:eastAsia="Kanit" w:cs="Kanit"/>
                 <w:color w:val="64748B"/>
                 <w:sz w:val="19"/>
                 <w:lang w:val="th-TH" w:bidi="th-TH"/>
@@ -1376,7 +1367,7 @@
             </w:pPr>
             <w:r>
               <w:rPr>
-                <w:rFonts w:ascii="Tahoma" w:hAnsi="Tahoma" w:eastAsia="Tahoma" w:cs="Tahoma"/>
+                <w:rFonts w:ascii="Kanit" w:hAnsi="Kanit" w:eastAsia="Kanit" w:cs="Kanit"/>
                 <w:b/>
                 <w:color w:val="FFFFFF"/>
                 <w:sz w:val="30"/>
@@ -1393,7 +1384,7 @@
           <w:p>
             <w:r>
               <w:rPr>
-                <w:rFonts w:ascii="Tahoma" w:hAnsi="Tahoma" w:eastAsia="Tahoma" w:cs="Tahoma"/>
+                <w:rFonts w:ascii="Kanit" w:hAnsi="Kanit" w:eastAsia="Kanit" w:cs="Kanit"/>
                 <w:b/>
                 <w:color w:val="1E293B"/>
                 <w:sz w:val="22"/>
@@ -1404,7 +1395,7 @@
             </w:r>
             <w:r>
               <w:rPr>
-                <w:rFonts w:ascii="Tahoma" w:hAnsi="Tahoma" w:eastAsia="Tahoma" w:cs="Tahoma"/>
+                <w:rFonts w:ascii="Kanit" w:hAnsi="Kanit" w:eastAsia="Kanit" w:cs="Kanit"/>
                 <w:color w:val="64748B"/>
                 <w:sz w:val="19"/>
                 <w:lang w:val="th-TH" w:bidi="th-TH"/>
@@ -1436,7 +1427,7 @@
           <w:p>
             <w:r>
               <w:rPr>
-                <w:rFonts w:ascii="Tahoma" w:hAnsi="Tahoma" w:eastAsia="Tahoma" w:cs="Tahoma"/>
+                <w:rFonts w:ascii="Kanit" w:hAnsi="Kanit" w:eastAsia="Kanit" w:cs="Kanit"/>
                 <w:b/>
                 <w:color w:val="172554"/>
                 <w:sz w:val="24"/>
@@ -1447,7 +1438,7 @@
             </w:r>
             <w:r>
               <w:rPr>
-                <w:rFonts w:ascii="Tahoma" w:hAnsi="Tahoma" w:eastAsia="Tahoma" w:cs="Tahoma"/>
+                <w:rFonts w:ascii="Kanit" w:hAnsi="Kanit" w:eastAsia="Kanit" w:cs="Kanit"/>
                 <w:sz w:val="20"/>
                 <w:lang w:val="th-TH" w:bidi="th-TH"/>
               </w:rPr>
@@ -1464,7 +1455,7 @@
       </w:pPr>
       <w:r>
         <w:rPr>
-          <w:rFonts w:ascii="Tahoma" w:hAnsi="Tahoma" w:eastAsia="Tahoma" w:cs="Tahoma"/>
+          <w:rFonts w:ascii="Kanit" w:hAnsi="Kanit" w:eastAsia="Kanit" w:cs="Kanit"/>
           <w:lang w:val="th-TH" w:bidi="th-TH"/>
         </w:rPr>
         <w:t>ถ้าติดตั้งไม่ได้</w:t>
@@ -1477,7 +1468,7 @@
       </w:pPr>
       <w:r>
         <w:rPr>
-          <w:rFonts w:ascii="Tahoma" w:hAnsi="Tahoma" w:eastAsia="Tahoma" w:cs="Tahoma"/>
+          <w:rFonts w:ascii="Kanit" w:hAnsi="Kanit" w:eastAsia="Kanit" w:cs="Kanit"/>
           <w:lang w:val="th-TH" w:bidi="th-TH"/>
         </w:rPr>
         <w:t>☐ ลบ APK ที่ดาวน์โหลดไม่ครบแล้วดาวน์โหลดใหม่</w:t>
@@ -1490,7 +1481,7 @@
       </w:pPr>
       <w:r>
         <w:rPr>
-          <w:rFonts w:ascii="Tahoma" w:hAnsi="Tahoma" w:eastAsia="Tahoma" w:cs="Tahoma"/>
+          <w:rFonts w:ascii="Kanit" w:hAnsi="Kanit" w:eastAsia="Kanit" w:cs="Kanit"/>
           <w:lang w:val="th-TH" w:bidi="th-TH"/>
         </w:rPr>
         <w:t>☐ ตรวจพื้นที่ว่างอย่างน้อย 300 MB</w:t>
@@ -1503,7 +1494,7 @@
       </w:pPr>
       <w:r>
         <w:rPr>
-          <w:rFonts w:ascii="Tahoma" w:hAnsi="Tahoma" w:eastAsia="Tahoma" w:cs="Tahoma"/>
+          <w:rFonts w:ascii="Kanit" w:hAnsi="Kanit" w:eastAsia="Kanit" w:cs="Kanit"/>
           <w:lang w:val="th-TH" w:bidi="th-TH"/>
         </w:rPr>
         <w:t>☐ หากมีแอปรุ่นทดสอบคนละลายเซ็น ให้ถอนรุ่นทดสอบก่อน</w:t>
@@ -1516,7 +1507,7 @@
       </w:pPr>
       <w:r>
         <w:rPr>
-          <w:rFonts w:ascii="Tahoma" w:hAnsi="Tahoma" w:eastAsia="Tahoma" w:cs="Tahoma"/>
+          <w:rFonts w:ascii="Kanit" w:hAnsi="Kanit" w:eastAsia="Kanit" w:cs="Kanit"/>
           <w:lang w:val="th-TH" w:bidi="th-TH"/>
         </w:rPr>
         <w:t>☐ อย่าแชร์ APK ผ่านแอปที่บีบอัดหรือเปลี่ยนชื่อไฟล์</w:t>
@@ -1525,7 +1516,7 @@
     <w:p>
       <w:r>
         <w:rPr>
-          <w:rFonts w:ascii="Tahoma" w:hAnsi="Tahoma" w:eastAsia="Tahoma" w:cs="Tahoma"/>
+          <w:rFonts w:ascii="Kanit" w:hAnsi="Kanit" w:eastAsia="Kanit" w:cs="Kanit"/>
           <w:lang w:val="th-TH" w:bidi="th-TH"/>
         </w:rPr>
         <w:br w:type="page"/>
@@ -1537,7 +1528,7 @@
       </w:pPr>
       <w:r>
         <w:rPr>
-          <w:rFonts w:ascii="Tahoma" w:hAnsi="Tahoma" w:eastAsia="Tahoma" w:cs="Tahoma"/>
+          <w:rFonts w:ascii="Kanit" w:hAnsi="Kanit" w:eastAsia="Kanit" w:cs="Kanit"/>
           <w:lang w:val="th-TH" w:bidi="th-TH"/>
         </w:rPr>
         <w:t>ผูกเครื่องด้วย QR และเปิดตรวจตลอดเวลา</w:t>
@@ -1549,7 +1540,7 @@
       </w:pPr>
       <w:r>
         <w:rPr>
-          <w:rFonts w:ascii="Tahoma" w:hAnsi="Tahoma" w:eastAsia="Tahoma" w:cs="Tahoma"/>
+          <w:rFonts w:ascii="Kanit" w:hAnsi="Kanit" w:eastAsia="Kanit" w:cs="Kanit"/>
           <w:lang w:val="th-TH" w:bidi="th-TH"/>
         </w:rPr>
         <w:t>ขั้นตอนนี้ต้องให้ Mobile data ของ TRUE เปิดอยู่</w:t>
@@ -1561,12 +1552,12 @@
       </w:pPr>
       <w:r>
         <w:rPr>
-          <w:rFonts w:ascii="Tahoma" w:hAnsi="Tahoma" w:eastAsia="Tahoma" w:cs="Tahoma"/>
+          <w:rFonts w:ascii="Kanit" w:hAnsi="Kanit" w:eastAsia="Kanit" w:cs="Kanit"/>
           <w:lang w:val="th-TH" w:bidi="th-TH"/>
         </w:rPr>
         <w:drawing>
           <wp:inline xmlns:a="http://schemas.openxmlformats.org/drawingml/2006/main" xmlns:pic="http://schemas.openxmlformats.org/drawingml/2006/picture">
-            <wp:extent cx="2835000" cy="5040000"/>
+            <wp:extent cx="2389500" cy="4248000"/>
             <wp:docPr id="4" name="Picture 4"/>
             <wp:cNvGraphicFramePr>
               <a:graphicFrameLocks noChangeAspect="1"/>
@@ -1587,7 +1578,7 @@
                   <pic:spPr>
                     <a:xfrm>
                       <a:off x="0" y="0"/>
-                      <a:ext cx="2835000" cy="5040000"/>
+                      <a:ext cx="2389500" cy="4248000"/>
                     </a:xfrm>
                     <a:prstGeom prst="rect"/>
                   </pic:spPr>
@@ -1622,7 +1613,7 @@
             </w:pPr>
             <w:r>
               <w:rPr>
-                <w:rFonts w:ascii="Tahoma" w:hAnsi="Tahoma" w:eastAsia="Tahoma" w:cs="Tahoma"/>
+                <w:rFonts w:ascii="Kanit" w:hAnsi="Kanit" w:eastAsia="Kanit" w:cs="Kanit"/>
                 <w:b/>
                 <w:color w:val="FFFFFF"/>
                 <w:sz w:val="30"/>
@@ -1639,7 +1630,7 @@
           <w:p>
             <w:r>
               <w:rPr>
-                <w:rFonts w:ascii="Tahoma" w:hAnsi="Tahoma" w:eastAsia="Tahoma" w:cs="Tahoma"/>
+                <w:rFonts w:ascii="Kanit" w:hAnsi="Kanit" w:eastAsia="Kanit" w:cs="Kanit"/>
                 <w:b/>
                 <w:color w:val="1E293B"/>
                 <w:sz w:val="22"/>
@@ -1650,7 +1641,7 @@
             </w:r>
             <w:r>
               <w:rPr>
-                <w:rFonts w:ascii="Tahoma" w:hAnsi="Tahoma" w:eastAsia="Tahoma" w:cs="Tahoma"/>
+                <w:rFonts w:ascii="Kanit" w:hAnsi="Kanit" w:eastAsia="Kanit" w:cs="Kanit"/>
                 <w:color w:val="64748B"/>
                 <w:sz w:val="19"/>
                 <w:lang w:val="th-TH" w:bidi="th-TH"/>
@@ -1673,7 +1664,7 @@
             </w:pPr>
             <w:r>
               <w:rPr>
-                <w:rFonts w:ascii="Tahoma" w:hAnsi="Tahoma" w:eastAsia="Tahoma" w:cs="Tahoma"/>
+                <w:rFonts w:ascii="Kanit" w:hAnsi="Kanit" w:eastAsia="Kanit" w:cs="Kanit"/>
                 <w:b/>
                 <w:color w:val="FFFFFF"/>
                 <w:sz w:val="30"/>
@@ -1690,7 +1681,7 @@
           <w:p>
             <w:r>
               <w:rPr>
-                <w:rFonts w:ascii="Tahoma" w:hAnsi="Tahoma" w:eastAsia="Tahoma" w:cs="Tahoma"/>
+                <w:rFonts w:ascii="Kanit" w:hAnsi="Kanit" w:eastAsia="Kanit" w:cs="Kanit"/>
                 <w:b/>
                 <w:color w:val="1E293B"/>
                 <w:sz w:val="22"/>
@@ -1701,7 +1692,7 @@
             </w:r>
             <w:r>
               <w:rPr>
-                <w:rFonts w:ascii="Tahoma" w:hAnsi="Tahoma" w:eastAsia="Tahoma" w:cs="Tahoma"/>
+                <w:rFonts w:ascii="Kanit" w:hAnsi="Kanit" w:eastAsia="Kanit" w:cs="Kanit"/>
                 <w:color w:val="64748B"/>
                 <w:sz w:val="19"/>
                 <w:lang w:val="th-TH" w:bidi="th-TH"/>
@@ -1724,7 +1715,7 @@
             </w:pPr>
             <w:r>
               <w:rPr>
-                <w:rFonts w:ascii="Tahoma" w:hAnsi="Tahoma" w:eastAsia="Tahoma" w:cs="Tahoma"/>
+                <w:rFonts w:ascii="Kanit" w:hAnsi="Kanit" w:eastAsia="Kanit" w:cs="Kanit"/>
                 <w:b/>
                 <w:color w:val="FFFFFF"/>
                 <w:sz w:val="30"/>
@@ -1741,7 +1732,7 @@
           <w:p>
             <w:r>
               <w:rPr>
-                <w:rFonts w:ascii="Tahoma" w:hAnsi="Tahoma" w:eastAsia="Tahoma" w:cs="Tahoma"/>
+                <w:rFonts w:ascii="Kanit" w:hAnsi="Kanit" w:eastAsia="Kanit" w:cs="Kanit"/>
                 <w:b/>
                 <w:color w:val="1E293B"/>
                 <w:sz w:val="22"/>
@@ -1752,7 +1743,7 @@
             </w:r>
             <w:r>
               <w:rPr>
-                <w:rFonts w:ascii="Tahoma" w:hAnsi="Tahoma" w:eastAsia="Tahoma" w:cs="Tahoma"/>
+                <w:rFonts w:ascii="Kanit" w:hAnsi="Kanit" w:eastAsia="Kanit" w:cs="Kanit"/>
                 <w:color w:val="64748B"/>
                 <w:sz w:val="19"/>
                 <w:lang w:val="th-TH" w:bidi="th-TH"/>
@@ -1775,7 +1766,7 @@
             </w:pPr>
             <w:r>
               <w:rPr>
-                <w:rFonts w:ascii="Tahoma" w:hAnsi="Tahoma" w:eastAsia="Tahoma" w:cs="Tahoma"/>
+                <w:rFonts w:ascii="Kanit" w:hAnsi="Kanit" w:eastAsia="Kanit" w:cs="Kanit"/>
                 <w:b/>
                 <w:color w:val="FFFFFF"/>
                 <w:sz w:val="30"/>
@@ -1792,7 +1783,7 @@
           <w:p>
             <w:r>
               <w:rPr>
-                <w:rFonts w:ascii="Tahoma" w:hAnsi="Tahoma" w:eastAsia="Tahoma" w:cs="Tahoma"/>
+                <w:rFonts w:ascii="Kanit" w:hAnsi="Kanit" w:eastAsia="Kanit" w:cs="Kanit"/>
                 <w:b/>
                 <w:color w:val="1E293B"/>
                 <w:sz w:val="22"/>
@@ -1803,7 +1794,7 @@
             </w:r>
             <w:r>
               <w:rPr>
-                <w:rFonts w:ascii="Tahoma" w:hAnsi="Tahoma" w:eastAsia="Tahoma" w:cs="Tahoma"/>
+                <w:rFonts w:ascii="Kanit" w:hAnsi="Kanit" w:eastAsia="Kanit" w:cs="Kanit"/>
                 <w:color w:val="64748B"/>
                 <w:sz w:val="19"/>
                 <w:lang w:val="th-TH" w:bidi="th-TH"/>
@@ -1821,7 +1812,7 @@
       </w:pPr>
       <w:r>
         <w:rPr>
-          <w:rFonts w:ascii="Tahoma" w:hAnsi="Tahoma" w:eastAsia="Tahoma" w:cs="Tahoma"/>
+          <w:rFonts w:ascii="Kanit" w:hAnsi="Kanit" w:eastAsia="Kanit" w:cs="Kanit"/>
           <w:lang w:val="th-TH" w:bidi="th-TH"/>
         </w:rPr>
         <w:t>ตรวจรับหลังติดตั้ง</w:t>
@@ -1833,7 +1824,7 @@
       </w:pPr>
       <w:r>
         <w:rPr>
-          <w:rFonts w:ascii="Tahoma" w:hAnsi="Tahoma" w:eastAsia="Tahoma" w:cs="Tahoma"/>
+          <w:rFonts w:ascii="Kanit" w:hAnsi="Kanit" w:eastAsia="Kanit" w:cs="Kanit"/>
           <w:lang w:val="th-TH" w:bidi="th-TH"/>
         </w:rPr>
         <w:t>อย่าถือว่าเสร็จจนกว่าจะเห็นผลรอบแรกจากซิมจริง</w:t>
@@ -1860,7 +1851,7 @@
           <w:p>
             <w:r>
               <w:rPr>
-                <w:rFonts w:ascii="Tahoma" w:hAnsi="Tahoma" w:eastAsia="Tahoma" w:cs="Tahoma"/>
+                <w:rFonts w:ascii="Kanit" w:hAnsi="Kanit" w:eastAsia="Kanit" w:cs="Kanit"/>
                 <w:b/>
                 <w:color w:val="FFFFFF"/>
                 <w:lang w:val="th-TH" w:bidi="th-TH"/>
@@ -1877,7 +1868,7 @@
           <w:p>
             <w:r>
               <w:rPr>
-                <w:rFonts w:ascii="Tahoma" w:hAnsi="Tahoma" w:eastAsia="Tahoma" w:cs="Tahoma"/>
+                <w:rFonts w:ascii="Kanit" w:hAnsi="Kanit" w:eastAsia="Kanit" w:cs="Kanit"/>
                 <w:b/>
                 <w:color w:val="FFFFFF"/>
                 <w:lang w:val="th-TH" w:bidi="th-TH"/>
@@ -1894,7 +1885,7 @@
           <w:p>
             <w:r>
               <w:rPr>
-                <w:rFonts w:ascii="Tahoma" w:hAnsi="Tahoma" w:eastAsia="Tahoma" w:cs="Tahoma"/>
+                <w:rFonts w:ascii="Kanit" w:hAnsi="Kanit" w:eastAsia="Kanit" w:cs="Kanit"/>
                 <w:b/>
                 <w:color w:val="FFFFFF"/>
                 <w:lang w:val="th-TH" w:bidi="th-TH"/>
@@ -1913,7 +1904,7 @@
           <w:p>
             <w:r>
               <w:rPr>
-                <w:rFonts w:ascii="Tahoma" w:hAnsi="Tahoma" w:eastAsia="Tahoma" w:cs="Tahoma"/>
+                <w:rFonts w:ascii="Kanit" w:hAnsi="Kanit" w:eastAsia="Kanit" w:cs="Kanit"/>
                 <w:lang w:val="th-TH" w:bidi="th-TH"/>
               </w:rPr>
               <w:t>โทรศัพท์</w:t>
@@ -1928,7 +1919,7 @@
           <w:p>
             <w:r>
               <w:rPr>
-                <w:rFonts w:ascii="Tahoma" w:hAnsi="Tahoma" w:eastAsia="Tahoma" w:cs="Tahoma"/>
+                <w:rFonts w:ascii="Kanit" w:hAnsi="Kanit" w:eastAsia="Kanit" w:cs="Kanit"/>
                 <w:lang w:val="th-TH" w:bidi="th-TH"/>
               </w:rPr>
               <w:t>🟢 กำลังตรวจตลอดเวลา</w:t>
@@ -1943,7 +1934,7 @@
           <w:p>
             <w:r>
               <w:rPr>
-                <w:rFonts w:ascii="Tahoma" w:hAnsi="Tahoma" w:eastAsia="Tahoma" w:cs="Tahoma"/>
+                <w:rFonts w:ascii="Kanit" w:hAnsi="Kanit" w:eastAsia="Kanit" w:cs="Kanit"/>
                 <w:lang w:val="th-TH" w:bidi="th-TH"/>
               </w:rPr>
               <w:t>เปิด Mobile data และกดเริ่มตรวจ</w:t>
@@ -1960,7 +1951,7 @@
           <w:p>
             <w:r>
               <w:rPr>
-                <w:rFonts w:ascii="Tahoma" w:hAnsi="Tahoma" w:eastAsia="Tahoma" w:cs="Tahoma"/>
+                <w:rFonts w:ascii="Kanit" w:hAnsi="Kanit" w:eastAsia="Kanit" w:cs="Kanit"/>
                 <w:lang w:val="th-TH" w:bidi="th-TH"/>
               </w:rPr>
               <w:t>หน้า /agents</w:t>
@@ -1975,7 +1966,7 @@
           <w:p>
             <w:r>
               <w:rPr>
-                <w:rFonts w:ascii="Tahoma" w:hAnsi="Tahoma" w:eastAsia="Tahoma" w:cs="Tahoma"/>
+                <w:rFonts w:ascii="Kanit" w:hAnsi="Kanit" w:eastAsia="Kanit" w:cs="Kanit"/>
                 <w:lang w:val="th-TH" w:bidi="th-TH"/>
               </w:rPr>
               <w:t>สถานะออนไลน์ ภายใน 5–7 นาที</w:t>
@@ -1990,7 +1981,7 @@
           <w:p>
             <w:r>
               <w:rPr>
-                <w:rFonts w:ascii="Tahoma" w:hAnsi="Tahoma" w:eastAsia="Tahoma" w:cs="Tahoma"/>
+                <w:rFonts w:ascii="Kanit" w:hAnsi="Kanit" w:eastAsia="Kanit" w:cs="Kanit"/>
                 <w:lang w:val="th-TH" w:bidi="th-TH"/>
               </w:rPr>
               <w:t>ตรวจแบตเตอรี่/สัญญาณ/เวลาเครื่อง</w:t>
@@ -2007,7 +1998,7 @@
           <w:p>
             <w:r>
               <w:rPr>
-                <w:rFonts w:ascii="Tahoma" w:hAnsi="Tahoma" w:eastAsia="Tahoma" w:cs="Tahoma"/>
+                <w:rFonts w:ascii="Kanit" w:hAnsi="Kanit" w:eastAsia="Kanit" w:cs="Kanit"/>
                 <w:lang w:val="th-TH" w:bidi="th-TH"/>
               </w:rPr>
               <w:t>ผล URL</w:t>
@@ -2022,7 +2013,7 @@
           <w:p>
             <w:r>
               <w:rPr>
-                <w:rFonts w:ascii="Tahoma" w:hAnsi="Tahoma" w:eastAsia="Tahoma" w:cs="Tahoma"/>
+                <w:rFonts w:ascii="Kanit" w:hAnsi="Kanit" w:eastAsia="Kanit" w:cs="Kanit"/>
                 <w:lang w:val="th-TH" w:bidi="th-TH"/>
               </w:rPr>
               <w:t>มี HTTP code และ response time</w:t>
@@ -2037,7 +2028,7 @@
           <w:p>
             <w:r>
               <w:rPr>
-                <w:rFonts w:ascii="Tahoma" w:hAnsi="Tahoma" w:eastAsia="Tahoma" w:cs="Tahoma"/>
+                <w:rFonts w:ascii="Kanit" w:hAnsi="Kanit" w:eastAsia="Kanit" w:cs="Kanit"/>
                 <w:lang w:val="th-TH" w:bidi="th-TH"/>
               </w:rPr>
               <w:t>รออีกรอบ หรือเปิดแอปดู error</w:t>
@@ -2054,7 +2045,7 @@
           <w:p>
             <w:r>
               <w:rPr>
-                <w:rFonts w:ascii="Tahoma" w:hAnsi="Tahoma" w:eastAsia="Tahoma" w:cs="Tahoma"/>
+                <w:rFonts w:ascii="Kanit" w:hAnsi="Kanit" w:eastAsia="Kanit" w:cs="Kanit"/>
                 <w:lang w:val="th-TH" w:bidi="th-TH"/>
               </w:rPr>
               <w:t>Telegram</w:t>
@@ -2069,7 +2060,7 @@
           <w:p>
             <w:r>
               <w:rPr>
-                <w:rFonts w:ascii="Tahoma" w:hAnsi="Tahoma" w:eastAsia="Tahoma" w:cs="Tahoma"/>
+                <w:rFonts w:ascii="Kanit" w:hAnsi="Kanit" w:eastAsia="Kanit" w:cs="Kanit"/>
                 <w:lang w:val="th-TH" w:bidi="th-TH"/>
               </w:rPr>
               <w:t>ไม่มีข้อความล่มจากเว็บที่เพียงช้า</w:t>
@@ -2084,7 +2075,7 @@
           <w:p>
             <w:r>
               <w:rPr>
-                <w:rFonts w:ascii="Tahoma" w:hAnsi="Tahoma" w:eastAsia="Tahoma" w:cs="Tahoma"/>
+                <w:rFonts w:ascii="Kanit" w:hAnsi="Kanit" w:eastAsia="Kanit" w:cs="Kanit"/>
                 <w:lang w:val="th-TH" w:bidi="th-TH"/>
               </w:rPr>
               <w:t>ดู failure streak ต้องครบ 2/2</w:t>
@@ -2101,7 +2092,7 @@
           <w:p>
             <w:r>
               <w:rPr>
-                <w:rFonts w:ascii="Tahoma" w:hAnsi="Tahoma" w:eastAsia="Tahoma" w:cs="Tahoma"/>
+                <w:rFonts w:ascii="Kanit" w:hAnsi="Kanit" w:eastAsia="Kanit" w:cs="Kanit"/>
                 <w:lang w:val="th-TH" w:bidi="th-TH"/>
               </w:rPr>
               <w:t>รีสตาร์ตเครื่อง</w:t>
@@ -2116,7 +2107,7 @@
           <w:p>
             <w:r>
               <w:rPr>
-                <w:rFonts w:ascii="Tahoma" w:hAnsi="Tahoma" w:eastAsia="Tahoma" w:cs="Tahoma"/>
+                <w:rFonts w:ascii="Kanit" w:hAnsi="Kanit" w:eastAsia="Kanit" w:cs="Kanit"/>
                 <w:lang w:val="th-TH" w:bidi="th-TH"/>
               </w:rPr>
               <w:t>บริการกลับมาทำงานอัตโนมัติ</w:t>
@@ -2131,7 +2122,7 @@
           <w:p>
             <w:r>
               <w:rPr>
-                <w:rFonts w:ascii="Tahoma" w:hAnsi="Tahoma" w:eastAsia="Tahoma" w:cs="Tahoma"/>
+                <w:rFonts w:ascii="Kanit" w:hAnsi="Kanit" w:eastAsia="Kanit" w:cs="Kanit"/>
                 <w:lang w:val="th-TH" w:bidi="th-TH"/>
               </w:rPr>
               <w:t>เปิดแอปหนึ่งครั้งและอนุญาตพื้นหลัง</w:t>
@@ -2161,7 +2152,7 @@
           <w:p>
             <w:r>
               <w:rPr>
-                <w:rFonts w:ascii="Tahoma" w:hAnsi="Tahoma" w:eastAsia="Tahoma" w:cs="Tahoma"/>
+                <w:rFonts w:ascii="Kanit" w:hAnsi="Kanit" w:eastAsia="Kanit" w:cs="Kanit"/>
                 <w:b/>
                 <w:color w:val="172554"/>
                 <w:sz w:val="24"/>
@@ -2172,7 +2163,7 @@
             </w:r>
             <w:r>
               <w:rPr>
-                <w:rFonts w:ascii="Tahoma" w:hAnsi="Tahoma" w:eastAsia="Tahoma" w:cs="Tahoma"/>
+                <w:rFonts w:ascii="Kanit" w:hAnsi="Kanit" w:eastAsia="Kanit" w:cs="Kanit"/>
                 <w:sz w:val="20"/>
                 <w:lang w:val="th-TH" w:bidi="th-TH"/>
               </w:rPr>
@@ -2189,7 +2180,7 @@
       </w:pPr>
       <w:r>
         <w:rPr>
-          <w:rFonts w:ascii="Tahoma" w:hAnsi="Tahoma" w:eastAsia="Tahoma" w:cs="Tahoma"/>
+          <w:rFonts w:ascii="Kanit" w:hAnsi="Kanit" w:eastAsia="Kanit" w:cs="Kanit"/>
           <w:lang w:val="th-TH" w:bidi="th-TH"/>
         </w:rPr>
         <w:t>ทดสอบจริงอย่างปลอดภัย</w:t>
@@ -2202,7 +2193,7 @@
       </w:pPr>
       <w:r>
         <w:rPr>
-          <w:rFonts w:ascii="Tahoma" w:hAnsi="Tahoma" w:eastAsia="Tahoma" w:cs="Tahoma"/>
+          <w:rFonts w:ascii="Kanit" w:hAnsi="Kanit" w:eastAsia="Kanit" w:cs="Kanit"/>
           <w:lang w:val="th-TH" w:bidi="th-TH"/>
         </w:rPr>
         <w:t>☐ ปิด Mobile data 10–12 นาทีเพื่อทดสอบสถานะขาดการเชื่อมต่อ แล้วเปิดกลับ</w:t>
@@ -2215,7 +2206,7 @@
       </w:pPr>
       <w:r>
         <w:rPr>
-          <w:rFonts w:ascii="Tahoma" w:hAnsi="Tahoma" w:eastAsia="Tahoma" w:cs="Tahoma"/>
+          <w:rFonts w:ascii="Kanit" w:hAnsi="Kanit" w:eastAsia="Kanit" w:cs="Kanit"/>
           <w:lang w:val="th-TH" w:bidi="th-TH"/>
         </w:rPr>
         <w:t>☐ ใช้ URL ทดสอบเฉพาะที่ทีมควบคุมได้ ห้ามทำให้เว็บจริงล่ม</w:t>
@@ -2228,7 +2219,7 @@
       </w:pPr>
       <w:r>
         <w:rPr>
-          <w:rFonts w:ascii="Tahoma" w:hAnsi="Tahoma" w:eastAsia="Tahoma" w:cs="Tahoma"/>
+          <w:rFonts w:ascii="Kanit" w:hAnsi="Kanit" w:eastAsia="Kanit" w:cs="Kanit"/>
           <w:lang w:val="th-TH" w:bidi="th-TH"/>
         </w:rPr>
         <w:t>☐ ตรวจว่า Telegram แจ้งล่มเมื่อผิดปกติ 2 รอบและแจ้งกลับเมื่อปกติ 2 รอบ</w:t>
@@ -2237,7 +2228,7 @@
     <w:p>
       <w:r>
         <w:rPr>
-          <w:rFonts w:ascii="Tahoma" w:hAnsi="Tahoma" w:eastAsia="Tahoma" w:cs="Tahoma"/>
+          <w:rFonts w:ascii="Kanit" w:hAnsi="Kanit" w:eastAsia="Kanit" w:cs="Kanit"/>
           <w:lang w:val="th-TH" w:bidi="th-TH"/>
         </w:rPr>
         <w:br w:type="page"/>
@@ -2249,7 +2240,7 @@
       </w:pPr>
       <w:r>
         <w:rPr>
-          <w:rFonts w:ascii="Tahoma" w:hAnsi="Tahoma" w:eastAsia="Tahoma" w:cs="Tahoma"/>
+          <w:rFonts w:ascii="Kanit" w:hAnsi="Kanit" w:eastAsia="Kanit" w:cs="Kanit"/>
           <w:lang w:val="th-TH" w:bidi="th-TH"/>
         </w:rPr>
         <w:t>การแจ้งเตือนและประวัติเหตุการณ์</w:t>
@@ -2261,7 +2252,7 @@
       </w:pPr>
       <w:r>
         <w:rPr>
-          <w:rFonts w:ascii="Tahoma" w:hAnsi="Tahoma" w:eastAsia="Tahoma" w:cs="Tahoma"/>
+          <w:rFonts w:ascii="Kanit" w:hAnsi="Kanit" w:eastAsia="Kanit" w:cs="Kanit"/>
           <w:lang w:val="th-TH" w:bidi="th-TH"/>
         </w:rPr>
         <w:t>เหตุการณ์จากซิมถูกเก็บแยกและอ้างอิง URL/บริษัท/ห้อง LINE ชัดเจน</w:t>
@@ -2289,7 +2280,7 @@
           <w:p>
             <w:r>
               <w:rPr>
-                <w:rFonts w:ascii="Tahoma" w:hAnsi="Tahoma" w:eastAsia="Tahoma" w:cs="Tahoma"/>
+                <w:rFonts w:ascii="Kanit" w:hAnsi="Kanit" w:eastAsia="Kanit" w:cs="Kanit"/>
                 <w:b/>
                 <w:color w:val="FFFFFF"/>
                 <w:lang w:val="th-TH" w:bidi="th-TH"/>
@@ -2306,7 +2297,7 @@
           <w:p>
             <w:r>
               <w:rPr>
-                <w:rFonts w:ascii="Tahoma" w:hAnsi="Tahoma" w:eastAsia="Tahoma" w:cs="Tahoma"/>
+                <w:rFonts w:ascii="Kanit" w:hAnsi="Kanit" w:eastAsia="Kanit" w:cs="Kanit"/>
                 <w:b/>
                 <w:color w:val="FFFFFF"/>
                 <w:lang w:val="th-TH" w:bidi="th-TH"/>
@@ -2323,7 +2314,7 @@
           <w:p>
             <w:r>
               <w:rPr>
-                <w:rFonts w:ascii="Tahoma" w:hAnsi="Tahoma" w:eastAsia="Tahoma" w:cs="Tahoma"/>
+                <w:rFonts w:ascii="Kanit" w:hAnsi="Kanit" w:eastAsia="Kanit" w:cs="Kanit"/>
                 <w:b/>
                 <w:color w:val="FFFFFF"/>
                 <w:lang w:val="th-TH" w:bidi="th-TH"/>
@@ -2340,7 +2331,7 @@
           <w:p>
             <w:r>
               <w:rPr>
-                <w:rFonts w:ascii="Tahoma" w:hAnsi="Tahoma" w:eastAsia="Tahoma" w:cs="Tahoma"/>
+                <w:rFonts w:ascii="Kanit" w:hAnsi="Kanit" w:eastAsia="Kanit" w:cs="Kanit"/>
                 <w:b/>
                 <w:color w:val="FFFFFF"/>
                 <w:lang w:val="th-TH" w:bidi="th-TH"/>
@@ -2358,7 +2349,7 @@
           <w:p>
             <w:r>
               <w:rPr>
-                <w:rFonts w:ascii="Tahoma" w:hAnsi="Tahoma" w:eastAsia="Tahoma" w:cs="Tahoma"/>
+                <w:rFonts w:ascii="Kanit" w:hAnsi="Kanit" w:eastAsia="Kanit" w:cs="Kanit"/>
                 <w:lang w:val="th-TH" w:bidi="th-TH"/>
               </w:rPr>
               <w:t>🟢 ใช้งานได้</w:t>
@@ -2372,7 +2363,7 @@
           <w:p>
             <w:r>
               <w:rPr>
-                <w:rFonts w:ascii="Tahoma" w:hAnsi="Tahoma" w:eastAsia="Tahoma" w:cs="Tahoma"/>
+                <w:rFonts w:ascii="Kanit" w:hAnsi="Kanit" w:eastAsia="Kanit" w:cs="Kanit"/>
                 <w:lang w:val="th-TH" w:bidi="th-TH"/>
               </w:rPr>
               <w:t>ตอบกลับในเกณฑ์</w:t>
@@ -2386,7 +2377,7 @@
           <w:p>
             <w:r>
               <w:rPr>
-                <w:rFonts w:ascii="Tahoma" w:hAnsi="Tahoma" w:eastAsia="Tahoma" w:cs="Tahoma"/>
+                <w:rFonts w:ascii="Kanit" w:hAnsi="Kanit" w:eastAsia="Kanit" w:cs="Kanit"/>
                 <w:lang w:val="th-TH" w:bidi="th-TH"/>
               </w:rPr>
               <w:t>UP</w:t>
@@ -2400,7 +2391,7 @@
           <w:p>
             <w:r>
               <w:rPr>
-                <w:rFonts w:ascii="Tahoma" w:hAnsi="Tahoma" w:eastAsia="Tahoma" w:cs="Tahoma"/>
+                <w:rFonts w:ascii="Kanit" w:hAnsi="Kanit" w:eastAsia="Kanit" w:cs="Kanit"/>
                 <w:lang w:val="th-TH" w:bidi="th-TH"/>
               </w:rPr>
               <w:t>ไม่แจ้งซ้ำ</w:t>
@@ -2416,7 +2407,7 @@
           <w:p>
             <w:r>
               <w:rPr>
-                <w:rFonts w:ascii="Tahoma" w:hAnsi="Tahoma" w:eastAsia="Tahoma" w:cs="Tahoma"/>
+                <w:rFonts w:ascii="Kanit" w:hAnsi="Kanit" w:eastAsia="Kanit" w:cs="Kanit"/>
                 <w:lang w:val="th-TH" w:bidi="th-TH"/>
               </w:rPr>
               <w:t>🟡 โหลดช้า</w:t>
@@ -2430,7 +2421,7 @@
           <w:p>
             <w:r>
               <w:rPr>
-                <w:rFonts w:ascii="Tahoma" w:hAnsi="Tahoma" w:eastAsia="Tahoma" w:cs="Tahoma"/>
+                <w:rFonts w:ascii="Kanit" w:hAnsi="Kanit" w:eastAsia="Kanit" w:cs="Kanit"/>
                 <w:lang w:val="th-TH" w:bidi="th-TH"/>
               </w:rPr>
               <w:t>ตอบได้แต่เกินเกณฑ์</w:t>
@@ -2444,7 +2435,7 @@
           <w:p>
             <w:r>
               <w:rPr>
-                <w:rFonts w:ascii="Tahoma" w:hAnsi="Tahoma" w:eastAsia="Tahoma" w:cs="Tahoma"/>
+                <w:rFonts w:ascii="Kanit" w:hAnsi="Kanit" w:eastAsia="Kanit" w:cs="Kanit"/>
                 <w:lang w:val="th-TH" w:bidi="th-TH"/>
               </w:rPr>
               <w:t>SLOW</w:t>
@@ -2458,7 +2449,7 @@
           <w:p>
             <w:r>
               <w:rPr>
-                <w:rFonts w:ascii="Tahoma" w:hAnsi="Tahoma" w:eastAsia="Tahoma" w:cs="Tahoma"/>
+                <w:rFonts w:ascii="Kanit" w:hAnsi="Kanit" w:eastAsia="Kanit" w:cs="Kanit"/>
                 <w:lang w:val="th-TH" w:bidi="th-TH"/>
               </w:rPr>
               <w:t>ไม่เปิดเคสล่ม</w:t>
@@ -2474,7 +2465,7 @@
           <w:p>
             <w:r>
               <w:rPr>
-                <w:rFonts w:ascii="Tahoma" w:hAnsi="Tahoma" w:eastAsia="Tahoma" w:cs="Tahoma"/>
+                <w:rFonts w:ascii="Kanit" w:hAnsi="Kanit" w:eastAsia="Kanit" w:cs="Kanit"/>
                 <w:lang w:val="th-TH" w:bidi="th-TH"/>
               </w:rPr>
               <w:t>🔴 ใช้ไม่ได้</w:t>
@@ -2488,7 +2479,7 @@
           <w:p>
             <w:r>
               <w:rPr>
-                <w:rFonts w:ascii="Tahoma" w:hAnsi="Tahoma" w:eastAsia="Tahoma" w:cs="Tahoma"/>
+                <w:rFonts w:ascii="Kanit" w:hAnsi="Kanit" w:eastAsia="Kanit" w:cs="Kanit"/>
                 <w:lang w:val="th-TH" w:bidi="th-TH"/>
               </w:rPr>
               <w:t>ผิดปกติ 2 รอบติด</w:t>
@@ -2502,7 +2493,7 @@
           <w:p>
             <w:r>
               <w:rPr>
-                <w:rFonts w:ascii="Tahoma" w:hAnsi="Tahoma" w:eastAsia="Tahoma" w:cs="Tahoma"/>
+                <w:rFonts w:ascii="Kanit" w:hAnsi="Kanit" w:eastAsia="Kanit" w:cs="Kanit"/>
                 <w:lang w:val="th-TH" w:bidi="th-TH"/>
               </w:rPr>
               <w:t>DOWN + เปิดเคส</w:t>
@@ -2516,7 +2507,7 @@
           <w:p>
             <w:r>
               <w:rPr>
-                <w:rFonts w:ascii="Tahoma" w:hAnsi="Tahoma" w:eastAsia="Tahoma" w:cs="Tahoma"/>
+                <w:rFonts w:ascii="Kanit" w:hAnsi="Kanit" w:eastAsia="Kanit" w:cs="Kanit"/>
                 <w:lang w:val="th-TH" w:bidi="th-TH"/>
               </w:rPr>
               <w:t>แจ้งล่มพร้อม URL/ห้อง</w:t>
@@ -2532,7 +2523,7 @@
           <w:p>
             <w:r>
               <w:rPr>
-                <w:rFonts w:ascii="Tahoma" w:hAnsi="Tahoma" w:eastAsia="Tahoma" w:cs="Tahoma"/>
+                <w:rFonts w:ascii="Kanit" w:hAnsi="Kanit" w:eastAsia="Kanit" w:cs="Kanit"/>
                 <w:lang w:val="th-TH" w:bidi="th-TH"/>
               </w:rPr>
               <w:t>🟢 กลับมาแล้ว</w:t>
@@ -2546,7 +2537,7 @@
           <w:p>
             <w:r>
               <w:rPr>
-                <w:rFonts w:ascii="Tahoma" w:hAnsi="Tahoma" w:eastAsia="Tahoma" w:cs="Tahoma"/>
+                <w:rFonts w:ascii="Kanit" w:hAnsi="Kanit" w:eastAsia="Kanit" w:cs="Kanit"/>
                 <w:lang w:val="th-TH" w:bidi="th-TH"/>
               </w:rPr>
               <w:t>ปกติ 2 รอบติด</w:t>
@@ -2560,7 +2551,7 @@
           <w:p>
             <w:r>
               <w:rPr>
-                <w:rFonts w:ascii="Tahoma" w:hAnsi="Tahoma" w:eastAsia="Tahoma" w:cs="Tahoma"/>
+                <w:rFonts w:ascii="Kanit" w:hAnsi="Kanit" w:eastAsia="Kanit" w:cs="Kanit"/>
                 <w:lang w:val="th-TH" w:bidi="th-TH"/>
               </w:rPr>
               <w:t>ปิดเคส</w:t>
@@ -2574,7 +2565,7 @@
           <w:p>
             <w:r>
               <w:rPr>
-                <w:rFonts w:ascii="Tahoma" w:hAnsi="Tahoma" w:eastAsia="Tahoma" w:cs="Tahoma"/>
+                <w:rFonts w:ascii="Kanit" w:hAnsi="Kanit" w:eastAsia="Kanit" w:cs="Kanit"/>
                 <w:lang w:val="th-TH" w:bidi="th-TH"/>
               </w:rPr>
               <w:t>แจ้งกลับมา แม้ยังช้า</w:t>
@@ -2604,7 +2595,7 @@
           <w:p>
             <w:r>
               <w:rPr>
-                <w:rFonts w:ascii="Tahoma" w:hAnsi="Tahoma" w:eastAsia="Tahoma" w:cs="Tahoma"/>
+                <w:rFonts w:ascii="Kanit" w:hAnsi="Kanit" w:eastAsia="Kanit" w:cs="Kanit"/>
                 <w:b/>
                 <w:color w:val="172554"/>
                 <w:sz w:val="24"/>
@@ -2615,7 +2606,7 @@
             </w:r>
             <w:r>
               <w:rPr>
-                <w:rFonts w:ascii="Tahoma" w:hAnsi="Tahoma" w:eastAsia="Tahoma" w:cs="Tahoma"/>
+                <w:rFonts w:ascii="Kanit" w:hAnsi="Kanit" w:eastAsia="Kanit" w:cs="Kanit"/>
                 <w:sz w:val="20"/>
                 <w:lang w:val="th-TH" w:bidi="th-TH"/>
               </w:rPr>
@@ -2632,7 +2623,7 @@
       </w:pPr>
       <w:r>
         <w:rPr>
-          <w:rFonts w:ascii="Tahoma" w:hAnsi="Tahoma" w:eastAsia="Tahoma" w:cs="Tahoma"/>
+          <w:rFonts w:ascii="Kanit" w:hAnsi="Kanit" w:eastAsia="Kanit" w:cs="Kanit"/>
           <w:lang w:val="th-TH" w:bidi="th-TH"/>
         </w:rPr>
         <w:t>ข้อมูลที่ต้องมีในประวัติ</w:t>
@@ -2645,7 +2636,7 @@
       </w:pPr>
       <w:r>
         <w:rPr>
-          <w:rFonts w:ascii="Tahoma" w:hAnsi="Tahoma" w:eastAsia="Tahoma" w:cs="Tahoma"/>
+          <w:rFonts w:ascii="Kanit" w:hAnsi="Kanit" w:eastAsia="Kanit" w:cs="Kanit"/>
           <w:lang w:val="th-TH" w:bidi="th-TH"/>
         </w:rPr>
         <w:t>☐ รหัสเคสและชื่อหน้า</w:t>
@@ -2658,7 +2649,7 @@
       </w:pPr>
       <w:r>
         <w:rPr>
-          <w:rFonts w:ascii="Tahoma" w:hAnsi="Tahoma" w:eastAsia="Tahoma" w:cs="Tahoma"/>
+          <w:rFonts w:ascii="Kanit" w:hAnsi="Kanit" w:eastAsia="Kanit" w:cs="Kanit"/>
           <w:lang w:val="th-TH" w:bidi="th-TH"/>
         </w:rPr>
         <w:t>☐ บริษัทและห้อง LINE</w:t>
@@ -2671,7 +2662,7 @@
       </w:pPr>
       <w:r>
         <w:rPr>
-          <w:rFonts w:ascii="Tahoma" w:hAnsi="Tahoma" w:eastAsia="Tahoma" w:cs="Tahoma"/>
+          <w:rFonts w:ascii="Kanit" w:hAnsi="Kanit" w:eastAsia="Kanit" w:cs="Kanit"/>
           <w:lang w:val="th-TH" w:bidi="th-TH"/>
         </w:rPr>
         <w:t>☐ URL ที่ตรวจจริง</w:t>
@@ -2684,7 +2675,7 @@
       </w:pPr>
       <w:r>
         <w:rPr>
-          <w:rFonts w:ascii="Tahoma" w:hAnsi="Tahoma" w:eastAsia="Tahoma" w:cs="Tahoma"/>
+          <w:rFonts w:ascii="Kanit" w:hAnsi="Kanit" w:eastAsia="Kanit" w:cs="Kanit"/>
           <w:lang w:val="th-TH" w:bidi="th-TH"/>
         </w:rPr>
         <w:t>☐ เครือข่าย TRUE และเครื่องตรวจ</w:t>
@@ -2697,7 +2688,7 @@
       </w:pPr>
       <w:r>
         <w:rPr>
-          <w:rFonts w:ascii="Tahoma" w:hAnsi="Tahoma" w:eastAsia="Tahoma" w:cs="Tahoma"/>
+          <w:rFonts w:ascii="Kanit" w:hAnsi="Kanit" w:eastAsia="Kanit" w:cs="Kanit"/>
           <w:lang w:val="th-TH" w:bidi="th-TH"/>
         </w:rPr>
         <w:t>☐ เวลาเริ่มค้าง/เวลาปิดเคส</w:t>
@@ -2710,7 +2701,7 @@
       </w:pPr>
       <w:r>
         <w:rPr>
-          <w:rFonts w:ascii="Tahoma" w:hAnsi="Tahoma" w:eastAsia="Tahoma" w:cs="Tahoma"/>
+          <w:rFonts w:ascii="Kanit" w:hAnsi="Kanit" w:eastAsia="Kanit" w:cs="Kanit"/>
           <w:lang w:val="th-TH" w:bidi="th-TH"/>
         </w:rPr>
         <w:t>☐ HTTP code, response time และสาเหตุล่าสุด</w:t>
@@ -2719,7 +2710,7 @@
     <w:p>
       <w:r>
         <w:rPr>
-          <w:rFonts w:ascii="Tahoma" w:hAnsi="Tahoma" w:eastAsia="Tahoma" w:cs="Tahoma"/>
+          <w:rFonts w:ascii="Kanit" w:hAnsi="Kanit" w:eastAsia="Kanit" w:cs="Kanit"/>
           <w:lang w:val="th-TH" w:bidi="th-TH"/>
         </w:rPr>
         <w:br w:type="page"/>
@@ -2731,7 +2722,7 @@
       </w:pPr>
       <w:r>
         <w:rPr>
-          <w:rFonts w:ascii="Tahoma" w:hAnsi="Tahoma" w:eastAsia="Tahoma" w:cs="Tahoma"/>
+          <w:rFonts w:ascii="Kanit" w:hAnsi="Kanit" w:eastAsia="Kanit" w:cs="Kanit"/>
           <w:lang w:val="th-TH" w:bidi="th-TH"/>
         </w:rPr>
         <w:t>ย้ายโทรศัพท์หรือเปลี่ยนซิม</w:t>
@@ -2743,7 +2734,7 @@
       </w:pPr>
       <w:r>
         <w:rPr>
-          <w:rFonts w:ascii="Tahoma" w:hAnsi="Tahoma" w:eastAsia="Tahoma" w:cs="Tahoma"/>
+          <w:rFonts w:ascii="Kanit" w:hAnsi="Kanit" w:eastAsia="Kanit" w:cs="Kanit"/>
           <w:lang w:val="th-TH" w:bidi="th-TH"/>
         </w:rPr>
         <w:t>ไม่ต้องแก้โค้ด ไม่ต้องสร้างระบบใหม่ และไม่ต้องใช้ QR เดิม</w:t>
@@ -2755,7 +2746,7 @@
       </w:pPr>
       <w:r>
         <w:rPr>
-          <w:rFonts w:ascii="Tahoma" w:hAnsi="Tahoma" w:eastAsia="Tahoma" w:cs="Tahoma"/>
+          <w:rFonts w:ascii="Kanit" w:hAnsi="Kanit" w:eastAsia="Kanit" w:cs="Kanit"/>
           <w:lang w:val="th-TH" w:bidi="th-TH"/>
         </w:rPr>
         <w:drawing>
@@ -2799,7 +2790,7 @@
       </w:pPr>
       <w:r>
         <w:rPr>
-          <w:rFonts w:ascii="Tahoma" w:hAnsi="Tahoma" w:eastAsia="Tahoma" w:cs="Tahoma"/>
+          <w:rFonts w:ascii="Kanit" w:hAnsi="Kanit" w:eastAsia="Kanit" w:cs="Kanit"/>
           <w:lang w:val="th-TH" w:bidi="th-TH"/>
         </w:rPr>
         <w:t>ภาพที่ 4 — Flow ย้ายเครื่องด้วย QR ใหม่</w:t>
@@ -2829,7 +2820,7 @@
             </w:pPr>
             <w:r>
               <w:rPr>
-                <w:rFonts w:ascii="Tahoma" w:hAnsi="Tahoma" w:eastAsia="Tahoma" w:cs="Tahoma"/>
+                <w:rFonts w:ascii="Kanit" w:hAnsi="Kanit" w:eastAsia="Kanit" w:cs="Kanit"/>
                 <w:b/>
                 <w:color w:val="FFFFFF"/>
                 <w:sz w:val="30"/>
@@ -2846,7 +2837,7 @@
           <w:p>
             <w:r>
               <w:rPr>
-                <w:rFonts w:ascii="Tahoma" w:hAnsi="Tahoma" w:eastAsia="Tahoma" w:cs="Tahoma"/>
+                <w:rFonts w:ascii="Kanit" w:hAnsi="Kanit" w:eastAsia="Kanit" w:cs="Kanit"/>
                 <w:b/>
                 <w:color w:val="1E293B"/>
                 <w:sz w:val="22"/>
@@ -2857,7 +2848,7 @@
             </w:r>
             <w:r>
               <w:rPr>
-                <w:rFonts w:ascii="Tahoma" w:hAnsi="Tahoma" w:eastAsia="Tahoma" w:cs="Tahoma"/>
+                <w:rFonts w:ascii="Kanit" w:hAnsi="Kanit" w:eastAsia="Kanit" w:cs="Kanit"/>
                 <w:color w:val="64748B"/>
                 <w:sz w:val="19"/>
                 <w:lang w:val="th-TH" w:bidi="th-TH"/>
@@ -2880,7 +2871,7 @@
             </w:pPr>
             <w:r>
               <w:rPr>
-                <w:rFonts w:ascii="Tahoma" w:hAnsi="Tahoma" w:eastAsia="Tahoma" w:cs="Tahoma"/>
+                <w:rFonts w:ascii="Kanit" w:hAnsi="Kanit" w:eastAsia="Kanit" w:cs="Kanit"/>
                 <w:b/>
                 <w:color w:val="FFFFFF"/>
                 <w:sz w:val="30"/>
@@ -2897,7 +2888,7 @@
           <w:p>
             <w:r>
               <w:rPr>
-                <w:rFonts w:ascii="Tahoma" w:hAnsi="Tahoma" w:eastAsia="Tahoma" w:cs="Tahoma"/>
+                <w:rFonts w:ascii="Kanit" w:hAnsi="Kanit" w:eastAsia="Kanit" w:cs="Kanit"/>
                 <w:b/>
                 <w:color w:val="1E293B"/>
                 <w:sz w:val="22"/>
@@ -2908,7 +2899,7 @@
             </w:r>
             <w:r>
               <w:rPr>
-                <w:rFonts w:ascii="Tahoma" w:hAnsi="Tahoma" w:eastAsia="Tahoma" w:cs="Tahoma"/>
+                <w:rFonts w:ascii="Kanit" w:hAnsi="Kanit" w:eastAsia="Kanit" w:cs="Kanit"/>
                 <w:color w:val="64748B"/>
                 <w:sz w:val="19"/>
                 <w:lang w:val="th-TH" w:bidi="th-TH"/>
@@ -2931,7 +2922,7 @@
             </w:pPr>
             <w:r>
               <w:rPr>
-                <w:rFonts w:ascii="Tahoma" w:hAnsi="Tahoma" w:eastAsia="Tahoma" w:cs="Tahoma"/>
+                <w:rFonts w:ascii="Kanit" w:hAnsi="Kanit" w:eastAsia="Kanit" w:cs="Kanit"/>
                 <w:b/>
                 <w:color w:val="FFFFFF"/>
                 <w:sz w:val="30"/>
@@ -2948,7 +2939,7 @@
           <w:p>
             <w:r>
               <w:rPr>
-                <w:rFonts w:ascii="Tahoma" w:hAnsi="Tahoma" w:eastAsia="Tahoma" w:cs="Tahoma"/>
+                <w:rFonts w:ascii="Kanit" w:hAnsi="Kanit" w:eastAsia="Kanit" w:cs="Kanit"/>
                 <w:b/>
                 <w:color w:val="1E293B"/>
                 <w:sz w:val="22"/>
@@ -2959,7 +2950,7 @@
             </w:r>
             <w:r>
               <w:rPr>
-                <w:rFonts w:ascii="Tahoma" w:hAnsi="Tahoma" w:eastAsia="Tahoma" w:cs="Tahoma"/>
+                <w:rFonts w:ascii="Kanit" w:hAnsi="Kanit" w:eastAsia="Kanit" w:cs="Kanit"/>
                 <w:color w:val="64748B"/>
                 <w:sz w:val="19"/>
                 <w:lang w:val="th-TH" w:bidi="th-TH"/>
@@ -2982,7 +2973,7 @@
             </w:pPr>
             <w:r>
               <w:rPr>
-                <w:rFonts w:ascii="Tahoma" w:hAnsi="Tahoma" w:eastAsia="Tahoma" w:cs="Tahoma"/>
+                <w:rFonts w:ascii="Kanit" w:hAnsi="Kanit" w:eastAsia="Kanit" w:cs="Kanit"/>
                 <w:b/>
                 <w:color w:val="FFFFFF"/>
                 <w:sz w:val="30"/>
@@ -2999,7 +2990,7 @@
           <w:p>
             <w:r>
               <w:rPr>
-                <w:rFonts w:ascii="Tahoma" w:hAnsi="Tahoma" w:eastAsia="Tahoma" w:cs="Tahoma"/>
+                <w:rFonts w:ascii="Kanit" w:hAnsi="Kanit" w:eastAsia="Kanit" w:cs="Kanit"/>
                 <w:b/>
                 <w:color w:val="1E293B"/>
                 <w:sz w:val="22"/>
@@ -3010,7 +3001,7 @@
             </w:r>
             <w:r>
               <w:rPr>
-                <w:rFonts w:ascii="Tahoma" w:hAnsi="Tahoma" w:eastAsia="Tahoma" w:cs="Tahoma"/>
+                <w:rFonts w:ascii="Kanit" w:hAnsi="Kanit" w:eastAsia="Kanit" w:cs="Kanit"/>
                 <w:color w:val="64748B"/>
                 <w:sz w:val="19"/>
                 <w:lang w:val="th-TH" w:bidi="th-TH"/>
@@ -3025,7 +3016,7 @@
     <w:p>
       <w:r>
         <w:rPr>
-          <w:rFonts w:ascii="Tahoma" w:hAnsi="Tahoma" w:eastAsia="Tahoma" w:cs="Tahoma"/>
+          <w:rFonts w:ascii="Kanit" w:hAnsi="Kanit" w:eastAsia="Kanit" w:cs="Kanit"/>
           <w:lang w:val="th-TH" w:bidi="th-TH"/>
         </w:rPr>
         <w:br w:type="page"/>
@@ -3037,7 +3028,7 @@
       </w:pPr>
       <w:r>
         <w:rPr>
-          <w:rFonts w:ascii="Tahoma" w:hAnsi="Tahoma" w:eastAsia="Tahoma" w:cs="Tahoma"/>
+          <w:rFonts w:ascii="Kanit" w:hAnsi="Kanit" w:eastAsia="Kanit" w:cs="Kanit"/>
           <w:lang w:val="th-TH" w:bidi="th-TH"/>
         </w:rPr>
         <w:t>ความปลอดภัยและชุดส่งมอบ</w:t>
@@ -3049,7 +3040,7 @@
       </w:pPr>
       <w:r>
         <w:rPr>
-          <w:rFonts w:ascii="Tahoma" w:hAnsi="Tahoma" w:eastAsia="Tahoma" w:cs="Tahoma"/>
+          <w:rFonts w:ascii="Kanit" w:hAnsi="Kanit" w:eastAsia="Kanit" w:cs="Kanit"/>
           <w:lang w:val="th-TH" w:bidi="th-TH"/>
         </w:rPr>
         <w:t>เก็บกุญแจเซ็นแอปแยกจาก GitHub และจำกัดสิทธิ์ผู้ดูแล</w:t>
@@ -3075,7 +3066,7 @@
           <w:p>
             <w:r>
               <w:rPr>
-                <w:rFonts w:ascii="Tahoma" w:hAnsi="Tahoma" w:eastAsia="Tahoma" w:cs="Tahoma"/>
+                <w:rFonts w:ascii="Kanit" w:hAnsi="Kanit" w:eastAsia="Kanit" w:cs="Kanit"/>
                 <w:b/>
                 <w:color w:val="172554"/>
                 <w:sz w:val="24"/>
@@ -3086,7 +3077,7 @@
             </w:r>
             <w:r>
               <w:rPr>
-                <w:rFonts w:ascii="Tahoma" w:hAnsi="Tahoma" w:eastAsia="Tahoma" w:cs="Tahoma"/>
+                <w:rFonts w:ascii="Kanit" w:hAnsi="Kanit" w:eastAsia="Kanit" w:cs="Kanit"/>
                 <w:sz w:val="20"/>
                 <w:lang w:val="th-TH" w:bidi="th-TH"/>
               </w:rPr>
@@ -3103,7 +3094,7 @@
       </w:pPr>
       <w:r>
         <w:rPr>
-          <w:rFonts w:ascii="Tahoma" w:hAnsi="Tahoma" w:eastAsia="Tahoma" w:cs="Tahoma"/>
+          <w:rFonts w:ascii="Kanit" w:hAnsi="Kanit" w:eastAsia="Kanit" w:cs="Kanit"/>
           <w:lang w:val="th-TH" w:bidi="th-TH"/>
         </w:rPr>
         <w:t>รายการไฟล์ส่งมอบ</w:t>
@@ -3130,7 +3121,7 @@
           <w:p>
             <w:r>
               <w:rPr>
-                <w:rFonts w:ascii="Tahoma" w:hAnsi="Tahoma" w:eastAsia="Tahoma" w:cs="Tahoma"/>
+                <w:rFonts w:ascii="Kanit" w:hAnsi="Kanit" w:eastAsia="Kanit" w:cs="Kanit"/>
                 <w:b/>
                 <w:color w:val="FFFFFF"/>
                 <w:lang w:val="th-TH" w:bidi="th-TH"/>
@@ -3147,7 +3138,7 @@
           <w:p>
             <w:r>
               <w:rPr>
-                <w:rFonts w:ascii="Tahoma" w:hAnsi="Tahoma" w:eastAsia="Tahoma" w:cs="Tahoma"/>
+                <w:rFonts w:ascii="Kanit" w:hAnsi="Kanit" w:eastAsia="Kanit" w:cs="Kanit"/>
                 <w:b/>
                 <w:color w:val="FFFFFF"/>
                 <w:lang w:val="th-TH" w:bidi="th-TH"/>
@@ -3164,7 +3155,7 @@
           <w:p>
             <w:r>
               <w:rPr>
-                <w:rFonts w:ascii="Tahoma" w:hAnsi="Tahoma" w:eastAsia="Tahoma" w:cs="Tahoma"/>
+                <w:rFonts w:ascii="Kanit" w:hAnsi="Kanit" w:eastAsia="Kanit" w:cs="Kanit"/>
                 <w:b/>
                 <w:color w:val="FFFFFF"/>
                 <w:lang w:val="th-TH" w:bidi="th-TH"/>
@@ -3182,7 +3173,7 @@
           <w:p>
             <w:r>
               <w:rPr>
-                <w:rFonts w:ascii="Tahoma" w:hAnsi="Tahoma" w:eastAsia="Tahoma" w:cs="Tahoma"/>
+                <w:rFonts w:ascii="Kanit" w:hAnsi="Kanit" w:eastAsia="Kanit" w:cs="Kanit"/>
                 <w:lang w:val="th-TH" w:bidi="th-TH"/>
               </w:rPr>
               <w:t>deliverables/public/DomainWatch-Agent-v1.0.0.apk</w:t>
@@ -3196,7 +3187,7 @@
           <w:p>
             <w:r>
               <w:rPr>
-                <w:rFonts w:ascii="Tahoma" w:hAnsi="Tahoma" w:eastAsia="Tahoma" w:cs="Tahoma"/>
+                <w:rFonts w:ascii="Kanit" w:hAnsi="Kanit" w:eastAsia="Kanit" w:cs="Kanit"/>
                 <w:lang w:val="th-TH" w:bidi="th-TH"/>
               </w:rPr>
               <w:t>ติดตั้งบนโทรศัพท์</w:t>
@@ -3210,7 +3201,7 @@
           <w:p>
             <w:r>
               <w:rPr>
-                <w:rFonts w:ascii="Tahoma" w:hAnsi="Tahoma" w:eastAsia="Tahoma" w:cs="Tahoma"/>
+                <w:rFonts w:ascii="Kanit" w:hAnsi="Kanit" w:eastAsia="Kanit" w:cs="Kanit"/>
                 <w:lang w:val="th-TH" w:bidi="th-TH"/>
               </w:rPr>
               <w:t>แชร์ให้ทีมติดตั้งได้</w:t>
@@ -3226,7 +3217,7 @@
           <w:p>
             <w:r>
               <w:rPr>
-                <w:rFonts w:ascii="Tahoma" w:hAnsi="Tahoma" w:eastAsia="Tahoma" w:cs="Tahoma"/>
+                <w:rFonts w:ascii="Kanit" w:hAnsi="Kanit" w:eastAsia="Kanit" w:cs="Kanit"/>
                 <w:lang w:val="th-TH" w:bidi="th-TH"/>
               </w:rPr>
               <w:t>android-agent/</w:t>
@@ -3240,7 +3231,7 @@
           <w:p>
             <w:r>
               <w:rPr>
-                <w:rFonts w:ascii="Tahoma" w:hAnsi="Tahoma" w:eastAsia="Tahoma" w:cs="Tahoma"/>
+                <w:rFonts w:ascii="Kanit" w:hAnsi="Kanit" w:eastAsia="Kanit" w:cs="Kanit"/>
                 <w:lang w:val="th-TH" w:bidi="th-TH"/>
               </w:rPr>
               <w:t>ซอร์ส Android สำหรับพัฒนาต่อ</w:t>
@@ -3254,7 +3245,7 @@
           <w:p>
             <w:r>
               <w:rPr>
-                <w:rFonts w:ascii="Tahoma" w:hAnsi="Tahoma" w:eastAsia="Tahoma" w:cs="Tahoma"/>
+                <w:rFonts w:ascii="Kanit" w:hAnsi="Kanit" w:eastAsia="Kanit" w:cs="Kanit"/>
                 <w:lang w:val="th-TH" w:bidi="th-TH"/>
               </w:rPr>
               <w:t>GitHub</w:t>
@@ -3270,7 +3261,7 @@
           <w:p>
             <w:r>
               <w:rPr>
-                <w:rFonts w:ascii="Tahoma" w:hAnsi="Tahoma" w:eastAsia="Tahoma" w:cs="Tahoma"/>
+                <w:rFonts w:ascii="Kanit" w:hAnsi="Kanit" w:eastAsia="Kanit" w:cs="Kanit"/>
                 <w:lang w:val="th-TH" w:bidi="th-TH"/>
               </w:rPr>
               <w:t>deliverables/private/*.jks</w:t>
@@ -3284,7 +3275,7 @@
           <w:p>
             <w:r>
               <w:rPr>
-                <w:rFonts w:ascii="Tahoma" w:hAnsi="Tahoma" w:eastAsia="Tahoma" w:cs="Tahoma"/>
+                <w:rFonts w:ascii="Kanit" w:hAnsi="Kanit" w:eastAsia="Kanit" w:cs="Kanit"/>
                 <w:lang w:val="th-TH" w:bidi="th-TH"/>
               </w:rPr>
               <w:t>กุญแจเซ็นอัปเดต APK</w:t>
@@ -3298,7 +3289,7 @@
           <w:p>
             <w:r>
               <w:rPr>
-                <w:rFonts w:ascii="Tahoma" w:hAnsi="Tahoma" w:eastAsia="Tahoma" w:cs="Tahoma"/>
+                <w:rFonts w:ascii="Kanit" w:hAnsi="Kanit" w:eastAsia="Kanit" w:cs="Kanit"/>
                 <w:lang w:val="th-TH" w:bidi="th-TH"/>
               </w:rPr>
               <w:t>Password manager/สื่อเข้ารหัส</w:t>
@@ -3314,7 +3305,7 @@
           <w:p>
             <w:r>
               <w:rPr>
-                <w:rFonts w:ascii="Tahoma" w:hAnsi="Tahoma" w:eastAsia="Tahoma" w:cs="Tahoma"/>
+                <w:rFonts w:ascii="Kanit" w:hAnsi="Kanit" w:eastAsia="Kanit" w:cs="Kanit"/>
                 <w:lang w:val="th-TH" w:bidi="th-TH"/>
               </w:rPr>
               <w:t>deliverables/private/SIGNING-KEY-README.txt</w:t>
@@ -3328,7 +3319,7 @@
           <w:p>
             <w:r>
               <w:rPr>
-                <w:rFonts w:ascii="Tahoma" w:hAnsi="Tahoma" w:eastAsia="Tahoma" w:cs="Tahoma"/>
+                <w:rFonts w:ascii="Kanit" w:hAnsi="Kanit" w:eastAsia="Kanit" w:cs="Kanit"/>
                 <w:lang w:val="th-TH" w:bidi="th-TH"/>
               </w:rPr>
               <w:t>ชื่อ alias และขั้นตอนเซ็น</w:t>
@@ -3342,7 +3333,7 @@
           <w:p>
             <w:r>
               <w:rPr>
-                <w:rFonts w:ascii="Tahoma" w:hAnsi="Tahoma" w:eastAsia="Tahoma" w:cs="Tahoma"/>
+                <w:rFonts w:ascii="Kanit" w:hAnsi="Kanit" w:eastAsia="Kanit" w:cs="Kanit"/>
                 <w:lang w:val="th-TH" w:bidi="th-TH"/>
               </w:rPr>
               <w:t>เก็บคู่กับ key แบบจำกัดสิทธิ์</w:t>
@@ -3358,7 +3349,7 @@
           <w:p>
             <w:r>
               <w:rPr>
-                <w:rFonts w:ascii="Tahoma" w:hAnsi="Tahoma" w:eastAsia="Tahoma" w:cs="Tahoma"/>
+                <w:rFonts w:ascii="Kanit" w:hAnsi="Kanit" w:eastAsia="Kanit" w:cs="Kanit"/>
                 <w:lang w:val="th-TH" w:bidi="th-TH"/>
               </w:rPr>
               <w:t>คู่มือ DOCX/PDF นี้</w:t>
@@ -3372,7 +3363,7 @@
           <w:p>
             <w:r>
               <w:rPr>
-                <w:rFonts w:ascii="Tahoma" w:hAnsi="Tahoma" w:eastAsia="Tahoma" w:cs="Tahoma"/>
+                <w:rFonts w:ascii="Kanit" w:hAnsi="Kanit" w:eastAsia="Kanit" w:cs="Kanit"/>
                 <w:lang w:val="th-TH" w:bidi="th-TH"/>
               </w:rPr>
               <w:t>ติดตั้ง/ตรวจรับ/ย้ายเครื่อง</w:t>
@@ -3386,7 +3377,7 @@
           <w:p>
             <w:r>
               <w:rPr>
-                <w:rFonts w:ascii="Tahoma" w:hAnsi="Tahoma" w:eastAsia="Tahoma" w:cs="Tahoma"/>
+                <w:rFonts w:ascii="Kanit" w:hAnsi="Kanit" w:eastAsia="Kanit" w:cs="Kanit"/>
                 <w:lang w:val="th-TH" w:bidi="th-TH"/>
               </w:rPr>
               <w:t>คลังเอกสารทีม</w:t>
@@ -3402,7 +3393,7 @@
       </w:pPr>
       <w:r>
         <w:rPr>
-          <w:rFonts w:ascii="Tahoma" w:hAnsi="Tahoma" w:eastAsia="Tahoma" w:cs="Tahoma"/>
+          <w:rFonts w:ascii="Kanit" w:hAnsi="Kanit" w:eastAsia="Kanit" w:cs="Kanit"/>
           <w:lang w:val="th-TH" w:bidi="th-TH"/>
         </w:rPr>
         <w:t>สิทธิ์ระบบ</w:t>
@@ -3415,7 +3406,7 @@
       </w:pPr>
       <w:r>
         <w:rPr>
-          <w:rFonts w:ascii="Tahoma" w:hAnsi="Tahoma" w:eastAsia="Tahoma" w:cs="Tahoma"/>
+          <w:rFonts w:ascii="Kanit" w:hAnsi="Kanit" w:eastAsia="Kanit" w:cs="Kanit"/>
           <w:lang w:val="th-TH" w:bidi="th-TH"/>
         </w:rPr>
         <w:t>☐ สร้าง/ย้าย/ปิด Mobile Agent: ADMIN เท่านั้น</w:t>
@@ -3428,7 +3419,7 @@
       </w:pPr>
       <w:r>
         <w:rPr>
-          <w:rFonts w:ascii="Tahoma" w:hAnsi="Tahoma" w:eastAsia="Tahoma" w:cs="Tahoma"/>
+          <w:rFonts w:ascii="Kanit" w:hAnsi="Kanit" w:eastAsia="Kanit" w:cs="Kanit"/>
           <w:lang w:val="th-TH" w:bidi="th-TH"/>
         </w:rPr>
         <w:t>☐ QR ใช้ครั้งเดียว อายุ 15 นาที และเก็บเฉพาะ hash ฝั่ง server</w:t>
@@ -3441,7 +3432,7 @@
       </w:pPr>
       <w:r>
         <w:rPr>
-          <w:rFonts w:ascii="Tahoma" w:hAnsi="Tahoma" w:eastAsia="Tahoma" w:cs="Tahoma"/>
+          <w:rFonts w:ascii="Kanit" w:hAnsi="Kanit" w:eastAsia="Kanit" w:cs="Kanit"/>
           <w:lang w:val="th-TH" w:bidi="th-TH"/>
         </w:rPr>
         <w:t>☐ token โทรศัพท์เก็บแบบเข้ารหัสด้วย Android Keystore</w:t>
@@ -3454,7 +3445,7 @@
       </w:pPr>
       <w:r>
         <w:rPr>
-          <w:rFonts w:ascii="Tahoma" w:hAnsi="Tahoma" w:eastAsia="Tahoma" w:cs="Tahoma"/>
+          <w:rFonts w:ascii="Kanit" w:hAnsi="Kanit" w:eastAsia="Kanit" w:cs="Kanit"/>
           <w:lang w:val="th-TH" w:bidi="th-TH"/>
         </w:rPr>
         <w:t>☐ เปลี่ยนเครื่องแล้ว token เครื่องเดิมถูกยกเลิก</w:t>
@@ -3467,7 +3458,7 @@
       </w:pPr>
       <w:r>
         <w:rPr>
-          <w:rFonts w:ascii="Tahoma" w:hAnsi="Tahoma" w:eastAsia="Tahoma" w:cs="Tahoma"/>
+          <w:rFonts w:ascii="Kanit" w:hAnsi="Kanit" w:eastAsia="Kanit" w:cs="Kanit"/>
           <w:lang w:val="th-TH" w:bidi="th-TH"/>
         </w:rPr>
         <w:t>☐ อย่าใส่ URL enrollment หรือ QR จริงในคู่มือ/แชตสาธารณะ</w:t>
@@ -3476,7 +3467,7 @@
     <w:p>
       <w:r>
         <w:rPr>
-          <w:rFonts w:ascii="Tahoma" w:hAnsi="Tahoma" w:eastAsia="Tahoma" w:cs="Tahoma"/>
+          <w:rFonts w:ascii="Kanit" w:hAnsi="Kanit" w:eastAsia="Kanit" w:cs="Kanit"/>
           <w:lang w:val="th-TH" w:bidi="th-TH"/>
         </w:rPr>
         <w:br w:type="page"/>
@@ -3488,7 +3479,7 @@
       </w:pPr>
       <w:r>
         <w:rPr>
-          <w:rFonts w:ascii="Tahoma" w:hAnsi="Tahoma" w:eastAsia="Tahoma" w:cs="Tahoma"/>
+          <w:rFonts w:ascii="Kanit" w:hAnsi="Kanit" w:eastAsia="Kanit" w:cs="Kanit"/>
           <w:lang w:val="th-TH" w:bidi="th-TH"/>
         </w:rPr>
         <w:t>Troubleshooting และเช็กลิสต์ส่งมอบ</w:t>
@@ -3500,7 +3491,7 @@
       </w:pPr>
       <w:r>
         <w:rPr>
-          <w:rFonts w:ascii="Tahoma" w:hAnsi="Tahoma" w:eastAsia="Tahoma" w:cs="Tahoma"/>
+          <w:rFonts w:ascii="Kanit" w:hAnsi="Kanit" w:eastAsia="Kanit" w:cs="Kanit"/>
           <w:lang w:val="th-TH" w:bidi="th-TH"/>
         </w:rPr>
         <w:t>ใช้หน้านี้เป็นใบตรวจรับก่อนปิดงาน</w:t>
@@ -3526,7 +3517,7 @@
           <w:p>
             <w:r>
               <w:rPr>
-                <w:rFonts w:ascii="Tahoma" w:hAnsi="Tahoma" w:eastAsia="Tahoma" w:cs="Tahoma"/>
+                <w:rFonts w:ascii="Kanit" w:hAnsi="Kanit" w:eastAsia="Kanit" w:cs="Kanit"/>
                 <w:b/>
                 <w:color w:val="FFFFFF"/>
                 <w:lang w:val="th-TH" w:bidi="th-TH"/>
@@ -3543,7 +3534,7 @@
           <w:p>
             <w:r>
               <w:rPr>
-                <w:rFonts w:ascii="Tahoma" w:hAnsi="Tahoma" w:eastAsia="Tahoma" w:cs="Tahoma"/>
+                <w:rFonts w:ascii="Kanit" w:hAnsi="Kanit" w:eastAsia="Kanit" w:cs="Kanit"/>
                 <w:b/>
                 <w:color w:val="FFFFFF"/>
                 <w:lang w:val="th-TH" w:bidi="th-TH"/>
@@ -3561,7 +3552,7 @@
           <w:p>
             <w:r>
               <w:rPr>
-                <w:rFonts w:ascii="Tahoma" w:hAnsi="Tahoma" w:eastAsia="Tahoma" w:cs="Tahoma"/>
+                <w:rFonts w:ascii="Kanit" w:hAnsi="Kanit" w:eastAsia="Kanit" w:cs="Kanit"/>
                 <w:lang w:val="th-TH" w:bidi="th-TH"/>
               </w:rPr>
               <w:t>QR เปิดเว็บแต่ไม่เข้าแอป</w:t>
@@ -3575,7 +3566,7 @@
           <w:p>
             <w:r>
               <w:rPr>
-                <w:rFonts w:ascii="Tahoma" w:hAnsi="Tahoma" w:eastAsia="Tahoma" w:cs="Tahoma"/>
+                <w:rFonts w:ascii="Kanit" w:hAnsi="Kanit" w:eastAsia="Kanit" w:cs="Kanit"/>
                 <w:lang w:val="th-TH" w:bidi="th-TH"/>
               </w:rPr>
               <w:t>ติดตั้ง APK ให้เสร็จ เปิดแอปหนึ่งครั้ง แล้วสแกน QR ใหม่</w:t>
@@ -3591,7 +3582,7 @@
           <w:p>
             <w:r>
               <w:rPr>
-                <w:rFonts w:ascii="Tahoma" w:hAnsi="Tahoma" w:eastAsia="Tahoma" w:cs="Tahoma"/>
+                <w:rFonts w:ascii="Kanit" w:hAnsi="Kanit" w:eastAsia="Kanit" w:cs="Kanit"/>
                 <w:lang w:val="th-TH" w:bidi="th-TH"/>
               </w:rPr>
               <w:t>QR หมดอายุ</w:t>
@@ -3605,7 +3596,7 @@
           <w:p>
             <w:r>
               <w:rPr>
-                <w:rFonts w:ascii="Tahoma" w:hAnsi="Tahoma" w:eastAsia="Tahoma" w:cs="Tahoma"/>
+                <w:rFonts w:ascii="Kanit" w:hAnsi="Kanit" w:eastAsia="Kanit" w:cs="Kanit"/>
                 <w:lang w:val="th-TH" w:bidi="th-TH"/>
               </w:rPr>
               <w:t>กด สร้าง QR / ย้ายเครื่อง ใหม่ ใช้ภายใน 15 นาที</w:t>
@@ -3621,7 +3612,7 @@
           <w:p>
             <w:r>
               <w:rPr>
-                <w:rFonts w:ascii="Tahoma" w:hAnsi="Tahoma" w:eastAsia="Tahoma" w:cs="Tahoma"/>
+                <w:rFonts w:ascii="Kanit" w:hAnsi="Kanit" w:eastAsia="Kanit" w:cs="Kanit"/>
                 <w:lang w:val="th-TH" w:bidi="th-TH"/>
               </w:rPr>
               <w:t>ผูกไม่สำเร็จ</w:t>
@@ -3635,7 +3626,7 @@
           <w:p>
             <w:r>
               <w:rPr>
-                <w:rFonts w:ascii="Tahoma" w:hAnsi="Tahoma" w:eastAsia="Tahoma" w:cs="Tahoma"/>
+                <w:rFonts w:ascii="Kanit" w:hAnsi="Kanit" w:eastAsia="Kanit" w:cs="Kanit"/>
                 <w:lang w:val="th-TH" w:bidi="th-TH"/>
               </w:rPr>
               <w:t>เปิด Mobile data TRUE, ปิด VPN/Data Saver ชั่วคราว และตั้งวันเวลาอัตโนมัติ</w:t>
@@ -3651,7 +3642,7 @@
           <w:p>
             <w:r>
               <w:rPr>
-                <w:rFonts w:ascii="Tahoma" w:hAnsi="Tahoma" w:eastAsia="Tahoma" w:cs="Tahoma"/>
+                <w:rFonts w:ascii="Kanit" w:hAnsi="Kanit" w:eastAsia="Kanit" w:cs="Kanit"/>
                 <w:lang w:val="th-TH" w:bidi="th-TH"/>
               </w:rPr>
               <w:t>เครื่องออฟไลน์หลังดับจอ</w:t>
@@ -3665,7 +3656,7 @@
           <w:p>
             <w:r>
               <w:rPr>
-                <w:rFonts w:ascii="Tahoma" w:hAnsi="Tahoma" w:eastAsia="Tahoma" w:cs="Tahoma"/>
+                <w:rFonts w:ascii="Kanit" w:hAnsi="Kanit" w:eastAsia="Kanit" w:cs="Kanit"/>
                 <w:lang w:val="th-TH" w:bidi="th-TH"/>
               </w:rPr>
               <w:t>ตั้งแบตเตอรี่เป็นไม่จำกัด, อนุญาต autostart และเสียบชาร์จ</w:t>
@@ -3681,7 +3672,7 @@
           <w:p>
             <w:r>
               <w:rPr>
-                <w:rFonts w:ascii="Tahoma" w:hAnsi="Tahoma" w:eastAsia="Tahoma" w:cs="Tahoma"/>
+                <w:rFonts w:ascii="Kanit" w:hAnsi="Kanit" w:eastAsia="Kanit" w:cs="Kanit"/>
                 <w:lang w:val="th-TH" w:bidi="th-TH"/>
               </w:rPr>
               <w:t>เห็นเว็บล่มทั้งที่เปิดได้</w:t>
@@ -3695,7 +3686,7 @@
           <w:p>
             <w:r>
               <w:rPr>
-                <w:rFonts w:ascii="Tahoma" w:hAnsi="Tahoma" w:eastAsia="Tahoma" w:cs="Tahoma"/>
+                <w:rFonts w:ascii="Kanit" w:hAnsi="Kanit" w:eastAsia="Kanit" w:cs="Kanit"/>
                 <w:lang w:val="th-TH" w:bidi="th-TH"/>
               </w:rPr>
               <w:t>ตรวจว่า agent ใช้ Cellular จริง, ดู HTTP/redirect และรอการยืนยัน 2 รอบ</w:t>
@@ -3711,7 +3702,7 @@
           <w:p>
             <w:r>
               <w:rPr>
-                <w:rFonts w:ascii="Tahoma" w:hAnsi="Tahoma" w:eastAsia="Tahoma" w:cs="Tahoma"/>
+                <w:rFonts w:ascii="Kanit" w:hAnsi="Kanit" w:eastAsia="Kanit" w:cs="Kanit"/>
                 <w:lang w:val="th-TH" w:bidi="th-TH"/>
               </w:rPr>
               <w:t>เว็บกลับมาแต่ช้า</w:t>
@@ -3725,7 +3716,7 @@
           <w:p>
             <w:r>
               <w:rPr>
-                <w:rFonts w:ascii="Tahoma" w:hAnsi="Tahoma" w:eastAsia="Tahoma" w:cs="Tahoma"/>
+                <w:rFonts w:ascii="Kanit" w:hAnsi="Kanit" w:eastAsia="Kanit" w:cs="Kanit"/>
                 <w:lang w:val="th-TH" w:bidi="th-TH"/>
               </w:rPr>
               <w:t>ระบบควรปิดเคสหลังปกติ 2 รอบและแจ้งกลับมาแล้ว พร้อมคงสถานะ SLOW</w:t>
@@ -3741,7 +3732,7 @@
           <w:p>
             <w:r>
               <w:rPr>
-                <w:rFonts w:ascii="Tahoma" w:hAnsi="Tahoma" w:eastAsia="Tahoma" w:cs="Tahoma"/>
+                <w:rFonts w:ascii="Kanit" w:hAnsi="Kanit" w:eastAsia="Kanit" w:cs="Kanit"/>
                 <w:lang w:val="th-TH" w:bidi="th-TH"/>
               </w:rPr>
               <w:t>ต้องอัปเดต APK</w:t>
@@ -3755,7 +3746,7 @@
           <w:p>
             <w:r>
               <w:rPr>
-                <w:rFonts w:ascii="Tahoma" w:hAnsi="Tahoma" w:eastAsia="Tahoma" w:cs="Tahoma"/>
+                <w:rFonts w:ascii="Kanit" w:hAnsi="Kanit" w:eastAsia="Kanit" w:cs="Kanit"/>
                 <w:lang w:val="th-TH" w:bidi="th-TH"/>
               </w:rPr>
               <w:t>ต้องเซ็นด้วยไฟล์ .jks เดิมและ versionCode สูงกว่าเดิม</w:t>
@@ -3771,7 +3762,7 @@
       </w:pPr>
       <w:r>
         <w:rPr>
-          <w:rFonts w:ascii="Tahoma" w:hAnsi="Tahoma" w:eastAsia="Tahoma" w:cs="Tahoma"/>
+          <w:rFonts w:ascii="Kanit" w:hAnsi="Kanit" w:eastAsia="Kanit" w:cs="Kanit"/>
           <w:lang w:val="th-TH" w:bidi="th-TH"/>
         </w:rPr>
         <w:t>ลงนามตรวจรับ</w:t>
@@ -3784,7 +3775,7 @@
       </w:pPr>
       <w:r>
         <w:rPr>
-          <w:rFonts w:ascii="Tahoma" w:hAnsi="Tahoma" w:eastAsia="Tahoma" w:cs="Tahoma"/>
+          <w:rFonts w:ascii="Kanit" w:hAnsi="Kanit" w:eastAsia="Kanit" w:cs="Kanit"/>
           <w:lang w:val="th-TH" w:bidi="th-TH"/>
         </w:rPr>
         <w:t>☐ ติดตั้ง APK และตรวจ SHA‑256 แล้ว</w:t>
@@ -3797,7 +3788,7 @@
       </w:pPr>
       <w:r>
         <w:rPr>
-          <w:rFonts w:ascii="Tahoma" w:hAnsi="Tahoma" w:eastAsia="Tahoma" w:cs="Tahoma"/>
+          <w:rFonts w:ascii="Kanit" w:hAnsi="Kanit" w:eastAsia="Kanit" w:cs="Kanit"/>
           <w:lang w:val="th-TH" w:bidi="th-TH"/>
         </w:rPr>
         <w:t>☐ สร้างเครื่อง TRUE และผูก QR สำเร็จ</w:t>
@@ -3810,7 +3801,7 @@
       </w:pPr>
       <w:r>
         <w:rPr>
-          <w:rFonts w:ascii="Tahoma" w:hAnsi="Tahoma" w:eastAsia="Tahoma" w:cs="Tahoma"/>
+          <w:rFonts w:ascii="Kanit" w:hAnsi="Kanit" w:eastAsia="Kanit" w:cs="Kanit"/>
           <w:lang w:val="th-TH" w:bidi="th-TH"/>
         </w:rPr>
         <w:t>☐ เห็นสถานะออนไลน์และผลตรวจรอบแรก</w:t>
@@ -3823,7 +3814,7 @@
       </w:pPr>
       <w:r>
         <w:rPr>
-          <w:rFonts w:ascii="Tahoma" w:hAnsi="Tahoma" w:eastAsia="Tahoma" w:cs="Tahoma"/>
+          <w:rFonts w:ascii="Kanit" w:hAnsi="Kanit" w:eastAsia="Kanit" w:cs="Kanit"/>
           <w:lang w:val="th-TH" w:bidi="th-TH"/>
         </w:rPr>
         <w:t>☐ ทดสอบรีสตาร์ต/ดับจอแล้ว agent ยังทำงาน</w:t>
@@ -3836,7 +3827,7 @@
       </w:pPr>
       <w:r>
         <w:rPr>
-          <w:rFonts w:ascii="Tahoma" w:hAnsi="Tahoma" w:eastAsia="Tahoma" w:cs="Tahoma"/>
+          <w:rFonts w:ascii="Kanit" w:hAnsi="Kanit" w:eastAsia="Kanit" w:cs="Kanit"/>
           <w:lang w:val="th-TH" w:bidi="th-TH"/>
         </w:rPr>
         <w:t>☐ ยืนยัน Telegram ล่ม/กลับมาและประวัติในระบบ</w:t>
@@ -3849,7 +3840,7 @@
       </w:pPr>
       <w:r>
         <w:rPr>
-          <w:rFonts w:ascii="Tahoma" w:hAnsi="Tahoma" w:eastAsia="Tahoma" w:cs="Tahoma"/>
+          <w:rFonts w:ascii="Kanit" w:hAnsi="Kanit" w:eastAsia="Kanit" w:cs="Kanit"/>
           <w:lang w:val="th-TH" w:bidi="th-TH"/>
         </w:rPr>
         <w:t>☐ สำรอง signing key ในที่ปลอดภัยอย่างน้อย 2 ชุด</w:t>
@@ -3862,7 +3853,7 @@
       </w:pPr>
       <w:r>
         <w:rPr>
-          <w:rFonts w:ascii="Tahoma" w:hAnsi="Tahoma" w:eastAsia="Tahoma" w:cs="Tahoma"/>
+          <w:rFonts w:ascii="Kanit" w:hAnsi="Kanit" w:eastAsia="Kanit" w:cs="Kanit"/>
           <w:lang w:val="th-TH" w:bidi="th-TH"/>
         </w:rPr>
         <w:t>☐ ผู้รับมอบได้รับ DOCX, PDF, APK และตำแหน่ง private key</w:t>
@@ -3874,7 +3865,7 @@
       </w:pPr>
       <w:r>
         <w:rPr>
-          <w:rFonts w:ascii="Tahoma" w:hAnsi="Tahoma" w:eastAsia="Tahoma" w:cs="Tahoma"/>
+          <w:rFonts w:ascii="Kanit" w:hAnsi="Kanit" w:eastAsia="Kanit" w:cs="Kanit"/>
           <w:lang w:val="th-TH" w:bidi="th-TH"/>
         </w:rPr>
         <w:br/>
@@ -3902,7 +3893,7 @@
     </w:pPr>
     <w:r>
       <w:rPr>
-        <w:rFonts w:ascii="Tahoma" w:hAnsi="Tahoma" w:eastAsia="Tahoma" w:cs="Tahoma"/>
+        <w:rFonts w:ascii="Kanit" w:hAnsi="Kanit" w:eastAsia="Kanit" w:cs="Kanit"/>
         <w:color w:val="64748B"/>
         <w:sz w:val="18"/>
       </w:rPr>
@@ -3921,7 +3912,7 @@
     </w:pPr>
     <w:r>
       <w:rPr>
-        <w:rFonts w:ascii="Tahoma" w:hAnsi="Tahoma" w:eastAsia="Tahoma" w:cs="Tahoma"/>
+        <w:rFonts w:ascii="Kanit" w:hAnsi="Kanit" w:eastAsia="Kanit" w:cs="Kanit"/>
       </w:rPr>
       <w:t>DOMAINWATCH  |  TRUE MOBILE AGENT</w:t>
     </w:r>
@@ -4296,7 +4287,7 @@
       <w:spacing w:after="100" w:line="259" w:lineRule="auto"/>
     </w:pPr>
     <w:rPr>
-      <w:rFonts w:ascii="Tahoma" w:hAnsi="Tahoma" w:eastAsia="Tahoma" w:cs="Tahoma"/>
+      <w:rFonts w:ascii="Kanit" w:hAnsi="Kanit" w:eastAsia="Kanit" w:cs="Kanit"/>
       <w:color w:val="1E293B"/>
       <w:sz w:val="21"/>
     </w:rPr>
@@ -4360,7 +4351,7 @@
       <w:outlineLvl w:val="0"/>
     </w:pPr>
     <w:rPr>
-      <w:rFonts w:asciiTheme="majorHAnsi" w:eastAsiaTheme="majorEastAsia" w:hAnsiTheme="majorHAnsi" w:cstheme="majorBidi" w:ascii="Tahoma" w:hAnsi="Tahoma" w:eastAsia="Tahoma" w:cs="Tahoma"/>
+      <w:rFonts w:asciiTheme="majorHAnsi" w:eastAsiaTheme="majorEastAsia" w:hAnsiTheme="majorHAnsi" w:cstheme="majorBidi" w:ascii="Kanit" w:hAnsi="Kanit" w:eastAsia="Kanit" w:cs="Kanit"/>
       <w:b/>
       <w:bCs/>
       <w:color w:val="172554"/>
@@ -4384,7 +4375,7 @@
       <w:outlineLvl w:val="1"/>
     </w:pPr>
     <w:rPr>
-      <w:rFonts w:asciiTheme="majorHAnsi" w:eastAsiaTheme="majorEastAsia" w:hAnsiTheme="majorHAnsi" w:cstheme="majorBidi" w:ascii="Tahoma" w:hAnsi="Tahoma" w:eastAsia="Tahoma" w:cs="Tahoma"/>
+      <w:rFonts w:asciiTheme="majorHAnsi" w:eastAsiaTheme="majorEastAsia" w:hAnsiTheme="majorHAnsi" w:cstheme="majorBidi" w:ascii="Kanit" w:hAnsi="Kanit" w:eastAsia="Kanit" w:cs="Kanit"/>
       <w:b/>
       <w:bCs/>
       <w:color w:val="2458E6"/>
@@ -4408,7 +4399,7 @@
       <w:outlineLvl w:val="2"/>
     </w:pPr>
     <w:rPr>
-      <w:rFonts w:asciiTheme="majorHAnsi" w:eastAsiaTheme="majorEastAsia" w:hAnsiTheme="majorHAnsi" w:cstheme="majorBidi" w:ascii="Tahoma" w:hAnsi="Tahoma" w:eastAsia="Tahoma" w:cs="Tahoma"/>
+      <w:rFonts w:asciiTheme="majorHAnsi" w:eastAsiaTheme="majorEastAsia" w:hAnsiTheme="majorHAnsi" w:cstheme="majorBidi" w:ascii="Kanit" w:hAnsi="Kanit" w:eastAsia="Kanit" w:cs="Kanit"/>
       <w:b/>
       <w:bCs/>
       <w:color w:val="1E293B"/>
@@ -4650,7 +4641,7 @@
       <w:contextualSpacing/>
     </w:pPr>
     <w:rPr>
-      <w:rFonts w:asciiTheme="majorHAnsi" w:eastAsiaTheme="majorEastAsia" w:hAnsiTheme="majorHAnsi" w:cstheme="majorBidi" w:ascii="Tahoma" w:hAnsi="Tahoma" w:eastAsia="Tahoma" w:cs="Tahoma"/>
+      <w:rFonts w:asciiTheme="majorHAnsi" w:eastAsiaTheme="majorEastAsia" w:hAnsiTheme="majorHAnsi" w:cstheme="majorBidi" w:ascii="Kanit" w:hAnsi="Kanit" w:eastAsia="Kanit" w:cs="Kanit"/>
       <w:b/>
       <w:color w:val="172554"/>
       <w:spacing w:val="5"/>
@@ -15991,7 +15982,7 @@
       <w:spacing w:after="160"/>
     </w:pPr>
     <w:rPr>
-      <w:rFonts w:ascii="Tahoma" w:hAnsi="Tahoma" w:eastAsia="Tahoma" w:cs="Tahoma"/>
+      <w:rFonts w:ascii="Kanit" w:hAnsi="Kanit" w:eastAsia="Kanit" w:cs="Kanit"/>
       <w:color w:val="64748B"/>
       <w:sz w:val="17"/>
     </w:rPr>

</xml_diff>